<commit_message>
Almost complete, need only some fixes and admin panel
</commit_message>
<xml_diff>
--- a/Записка.docx
+++ b/Записка.docx
@@ -1422,6 +1422,51 @@
         </w:rPr>
       </w:pPr>
       <w:r>
+        <w:drawing>
+          <wp:inline distT="0" distB="0" distL="114300" distR="114300">
+            <wp:extent cx="6297295" cy="3546475"/>
+            <wp:effectExtent l="0" t="0" r="12065" b="4445"/>
+            <wp:docPr id="3" name="Изображение 1"/>
+            <wp:cNvGraphicFramePr>
+              <a:graphicFrameLocks xmlns:a="http://schemas.openxmlformats.org/drawingml/2006/main" noChangeAspect="1"/>
+            </wp:cNvGraphicFramePr>
+            <a:graphic xmlns:a="http://schemas.openxmlformats.org/drawingml/2006/main">
+              <a:graphicData uri="http://schemas.openxmlformats.org/drawingml/2006/picture">
+                <pic:pic xmlns:pic="http://schemas.openxmlformats.org/drawingml/2006/picture">
+                  <pic:nvPicPr>
+                    <pic:cNvPr id="3" name="Изображение 1"/>
+                    <pic:cNvPicPr>
+                      <a:picLocks noChangeAspect="1"/>
+                    </pic:cNvPicPr>
+                  </pic:nvPicPr>
+                  <pic:blipFill>
+                    <a:blip r:embed="rId6"/>
+                    <a:stretch>
+                      <a:fillRect/>
+                    </a:stretch>
+                  </pic:blipFill>
+                  <pic:spPr>
+                    <a:xfrm>
+                      <a:off x="0" y="0"/>
+                      <a:ext cx="6297295" cy="3546475"/>
+                    </a:xfrm>
+                    <a:prstGeom prst="rect">
+                      <a:avLst/>
+                    </a:prstGeom>
+                    <a:noFill/>
+                    <a:ln>
+                      <a:noFill/>
+                    </a:ln>
+                  </pic:spPr>
+                </pic:pic>
+              </a:graphicData>
+            </a:graphic>
+          </wp:inline>
+        </w:drawing>
+      </w:r>
+      <w:bookmarkStart w:id="1" w:name="_GoBack"/>
+      <w:bookmarkEnd w:id="1"/>
+      <w:r>
         <w:rPr>
           <w:rFonts w:hint="default" w:eastAsia="Times New Roman" w:cs="Times New Roman"/>
           <w:szCs w:val="28"/>
@@ -1431,7 +1476,7 @@
         <w:drawing>
           <wp:inline distT="0" distB="0" distL="114300" distR="114300">
             <wp:extent cx="9594215" cy="5395595"/>
-            <wp:effectExtent l="0" t="0" r="14605" b="6985"/>
+            <wp:effectExtent l="0" t="0" r="6985" b="14605"/>
             <wp:docPr id="1" name="Изображение 1" descr="UseCase.drawio"/>
             <wp:cNvGraphicFramePr>
               <a:graphicFrameLocks xmlns:a="http://schemas.openxmlformats.org/drawingml/2006/main" noChangeAspect="1"/>
@@ -1446,13 +1491,13 @@
                     </pic:cNvPicPr>
                   </pic:nvPicPr>
                   <pic:blipFill>
-                    <a:blip r:embed="rId6"/>
+                    <a:blip r:embed="rId7"/>
                     <a:stretch>
                       <a:fillRect/>
                     </a:stretch>
                   </pic:blipFill>
                   <pic:spPr>
-                    <a:xfrm rot="5400000">
+                    <a:xfrm>
                       <a:off x="0" y="0"/>
                       <a:ext cx="9594215" cy="5395595"/>
                     </a:xfrm>
@@ -1491,7 +1536,7 @@
                     </pic:cNvPicPr>
                   </pic:nvPicPr>
                   <pic:blipFill>
-                    <a:blip r:embed="rId7"/>
+                    <a:blip r:embed="rId8"/>
                     <a:stretch>
                       <a:fillRect/>
                     </a:stretch>
@@ -1511,8 +1556,6 @@
           </wp:inline>
         </w:drawing>
       </w:r>
-      <w:bookmarkStart w:id="1" w:name="_GoBack"/>
-      <w:bookmarkEnd w:id="1"/>
     </w:p>
     <w:sectPr>
       <w:pgSz w:w="11906" w:h="16838"/>

</xml_diff>

<commit_message>
first chapter of letter
</commit_message>
<xml_diff>
--- a/Записка.docx
+++ b/Записка.docx
@@ -568,7 +568,7 @@
           <w:u w:val="single"/>
           <w:lang w:val="ru-RU"/>
         </w:rPr>
-        <w:t xml:space="preserve"> Егор Николавич</w:t>
+        <w:t xml:space="preserve"> Егор Николаевич</w:t>
       </w:r>
       <w:r>
         <w:rPr>
@@ -998,7 +998,22 @@
           <w:rFonts w:cs="Times New Roman"/>
           <w:szCs w:val="28"/>
         </w:rPr>
-        <w:t xml:space="preserve">Курсовой проект защищен с оценкой </w:t>
+        <w:t>Курсовой проект защищ</w:t>
+      </w:r>
+      <w:r>
+        <w:rPr>
+          <w:rFonts w:cs="Times New Roman"/>
+          <w:szCs w:val="28"/>
+          <w:lang w:val="ru-RU"/>
+        </w:rPr>
+        <w:t>ё</w:t>
+      </w:r>
+      <w:r>
+        <w:rPr>
+          <w:rFonts w:cs="Times New Roman"/>
+          <w:szCs w:val="28"/>
+        </w:rPr>
+        <w:t xml:space="preserve">н с оценкой </w:t>
       </w:r>
       <w:r>
         <w:rPr>
@@ -1191,7 +1206,7 @@
     </w:p>
     <w:p>
       <w:pPr>
-        <w:pStyle w:val="12"/>
+        <w:pStyle w:val="14"/>
         <w:tabs>
           <w:tab w:val="center" w:pos="4677"/>
           <w:tab w:val="right" w:pos="9355"/>
@@ -1215,7 +1230,7 @@
     </w:p>
     <w:p>
       <w:pPr>
-        <w:pStyle w:val="8"/>
+        <w:pStyle w:val="9"/>
         <w:tabs>
           <w:tab w:val="right" w:leader="dot" w:pos="9355"/>
           <w:tab w:val="clear" w:pos="567"/>
@@ -1236,7 +1251,7 @@
         <w:fldChar w:fldCharType="begin"/>
       </w:r>
       <w:r>
-        <w:instrText xml:space="preserve"> HYPERLINK \l _Toc29806 </w:instrText>
+        <w:instrText xml:space="preserve"> HYPERLINK \l _Toc3980 </w:instrText>
       </w:r>
       <w:r>
         <w:fldChar w:fldCharType="separate"/>
@@ -1251,13 +1266,108 @@
         <w:fldChar w:fldCharType="begin"/>
       </w:r>
       <w:r>
-        <w:instrText xml:space="preserve"> PAGEREF _Toc29806 \h </w:instrText>
+        <w:instrText xml:space="preserve"> PAGEREF _Toc3980 \h </w:instrText>
       </w:r>
       <w:r>
         <w:fldChar w:fldCharType="separate"/>
       </w:r>
       <w:r>
-        <w:t>2</w:t>
+        <w:t>3</w:t>
+      </w:r>
+      <w:r>
+        <w:fldChar w:fldCharType="end"/>
+      </w:r>
+      <w:r>
+        <w:fldChar w:fldCharType="end"/>
+      </w:r>
+    </w:p>
+    <w:p>
+      <w:pPr>
+        <w:pStyle w:val="9"/>
+        <w:tabs>
+          <w:tab w:val="right" w:leader="dot" w:pos="9355"/>
+          <w:tab w:val="clear" w:pos="567"/>
+          <w:tab w:val="clear" w:pos="1200"/>
+          <w:tab w:val="clear" w:pos="9345"/>
+        </w:tabs>
+      </w:pPr>
+      <w:r>
+        <w:fldChar w:fldCharType="begin"/>
+      </w:r>
+      <w:r>
+        <w:instrText xml:space="preserve"> HYPERLINK \l _Toc4882 </w:instrText>
+      </w:r>
+      <w:r>
+        <w:fldChar w:fldCharType="separate"/>
+      </w:r>
+      <w:r>
+        <w:t>1</w:t>
+      </w:r>
+      <w:r>
+        <w:rPr>
+          <w:lang w:val="be-BY"/>
+        </w:rPr>
+        <w:t xml:space="preserve"> </w:t>
+      </w:r>
+      <w:r>
+        <w:t>Постановка задачи и обзор аналогичных решений</w:t>
+      </w:r>
+      <w:r>
+        <w:tab/>
+      </w:r>
+      <w:r>
+        <w:fldChar w:fldCharType="begin"/>
+      </w:r>
+      <w:r>
+        <w:instrText xml:space="preserve"> PAGEREF _Toc4882 \h </w:instrText>
+      </w:r>
+      <w:r>
+        <w:fldChar w:fldCharType="separate"/>
+      </w:r>
+      <w:r>
+        <w:t>4</w:t>
+      </w:r>
+      <w:r>
+        <w:fldChar w:fldCharType="end"/>
+      </w:r>
+      <w:r>
+        <w:fldChar w:fldCharType="end"/>
+      </w:r>
+    </w:p>
+    <w:p>
+      <w:pPr>
+        <w:pStyle w:val="11"/>
+        <w:tabs>
+          <w:tab w:val="right" w:leader="dot" w:pos="9355"/>
+          <w:tab w:val="clear" w:pos="9345"/>
+        </w:tabs>
+      </w:pPr>
+      <w:r>
+        <w:fldChar w:fldCharType="begin"/>
+      </w:r>
+      <w:r>
+        <w:instrText xml:space="preserve"> HYPERLINK \l _Toc8090 </w:instrText>
+      </w:r>
+      <w:r>
+        <w:fldChar w:fldCharType="separate"/>
+      </w:r>
+      <w:r>
+        <w:t>1.1 Постановка задачи</w:t>
+      </w:r>
+      <w:r>
+        <w:tab/>
+      </w:r>
+      <w:r>
+        <w:fldChar w:fldCharType="begin"/>
+      </w:r>
+      <w:r>
+        <w:instrText xml:space="preserve"> PAGEREF _Toc8090 \h </w:instrText>
+      </w:r>
+      <w:r>
+        <w:fldChar w:fldCharType="separate"/>
+      </w:r>
+      <w:r>
+        <w:t>4</w:t>
       </w:r>
       <w:r>
         <w:fldChar w:fldCharType="end"/>
@@ -1302,7 +1412,7 @@
         <w:jc w:val="center"/>
         <w:textAlignment w:val="auto"/>
       </w:pPr>
-      <w:bookmarkStart w:id="1" w:name="_Toc29806"/>
+      <w:bookmarkStart w:id="1" w:name="_Toc3980"/>
       <w:r>
         <w:t>Введение</w:t>
       </w:r>
@@ -1586,6 +1696,7 @@
         <w:pStyle w:val="2"/>
       </w:pPr>
       <w:bookmarkStart w:id="2" w:name="_Toc229527905"/>
+      <w:bookmarkStart w:id="3" w:name="_Toc4882"/>
       <w:r>
         <w:t>1</w:t>
       </w:r>
@@ -1599,35 +1710,1801 @@
         <w:t>Постановка задачи и обзор аналогичных решений</w:t>
       </w:r>
       <w:bookmarkEnd w:id="2"/>
+      <w:bookmarkEnd w:id="3"/>
     </w:p>
     <w:p>
       <w:pPr>
         <w:pStyle w:val="3"/>
         <w:spacing w:before="120" w:after="240"/>
       </w:pPr>
-      <w:bookmarkStart w:id="3" w:name="_Toc229527906"/>
+      <w:bookmarkStart w:id="4" w:name="_Toc229527906"/>
+      <w:bookmarkStart w:id="5" w:name="_Toc8090"/>
       <w:r>
         <w:t>1.1 Постановка задачи</w:t>
       </w:r>
-      <w:bookmarkEnd w:id="3"/>
-    </w:p>
-    <w:p>
-      <w:pPr>
+      <w:bookmarkEnd w:id="4"/>
+      <w:bookmarkEnd w:id="5"/>
+    </w:p>
+    <w:p>
+      <w:pPr>
+        <w:keepNext w:val="0"/>
+        <w:keepLines w:val="0"/>
+        <w:pageBreakBefore w:val="0"/>
+        <w:widowControl/>
+        <w:kinsoku/>
+        <w:wordWrap/>
+        <w:overflowPunct/>
+        <w:topLinePunct w:val="0"/>
+        <w:autoSpaceDE/>
+        <w:autoSpaceDN/>
+        <w:bidi w:val="0"/>
+        <w:adjustRightInd/>
+        <w:snapToGrid/>
+        <w:spacing w:line="264" w:lineRule="auto"/>
+        <w:ind w:firstLine="706"/>
+        <w:textAlignment w:val="auto"/>
+      </w:pPr>
+      <w:r>
+        <w:t>Разработка веб-приложения[1] «HireVich» («Рекрутинг») направлена на создание универсальной онлайн-платформы для комплексной автоматизации и сквозного контроля процесса взаимодействия между соискателями (кандидатами) и специалистами по подбору персонала (рекрутерами).</w:t>
+      </w:r>
+    </w:p>
+    <w:p>
+      <w:pPr>
+        <w:keepNext w:val="0"/>
+        <w:keepLines w:val="0"/>
+        <w:pageBreakBefore w:val="0"/>
+        <w:widowControl/>
+        <w:kinsoku/>
+        <w:wordWrap/>
+        <w:overflowPunct/>
+        <w:topLinePunct w:val="0"/>
+        <w:autoSpaceDE/>
+        <w:autoSpaceDN/>
+        <w:bidi w:val="0"/>
+        <w:adjustRightInd/>
+        <w:snapToGrid/>
+        <w:spacing w:line="264" w:lineRule="auto"/>
+        <w:ind w:firstLine="706"/>
+        <w:textAlignment w:val="auto"/>
+      </w:pPr>
+      <w:r>
+        <w:t>Пользователи системы проходят процедуру регистрации и аутентификации с последующим разграничением прав доступа на основе ролевой модели (Администратор, Рекрутер, Кандидат). Соискатели имеют возможность осуществлять поиск, фильтрацию и сохранение вакансий, редактировать персональный профиль, подавать отклики на интересующие позиции и прозрачно отслеживать статус своей заявки по этапам воронки отбора.</w:t>
+      </w:r>
+    </w:p>
+    <w:p>
+      <w:pPr>
+        <w:keepNext w:val="0"/>
+        <w:keepLines w:val="0"/>
+        <w:pageBreakBefore w:val="0"/>
+        <w:widowControl/>
+        <w:kinsoku/>
+        <w:wordWrap/>
+        <w:overflowPunct/>
+        <w:topLinePunct w:val="0"/>
+        <w:autoSpaceDE/>
+        <w:autoSpaceDN/>
+        <w:bidi w:val="0"/>
+        <w:adjustRightInd/>
+        <w:snapToGrid/>
+        <w:spacing w:line="264" w:lineRule="auto"/>
+        <w:ind w:firstLine="706"/>
+        <w:textAlignment w:val="auto"/>
+      </w:pPr>
+      <w:r>
+        <w:t>Рекрутер осуществляет управление жизненным циклом вакансий (публикация, редактирование, закрытие), формирует динамические чек-листы этапов отбора для каждой позиции (на баз</w:t>
+      </w:r>
+      <w:r>
+        <w:rPr>
+          <w:lang w:val="ru-RU"/>
+        </w:rPr>
+        <w:t>е</w:t>
+      </w:r>
+      <w:r>
+        <w:rPr>
+          <w:rFonts w:hint="default"/>
+          <w:lang w:val="ru-RU"/>
+        </w:rPr>
+        <w:t xml:space="preserve"> </w:t>
+      </w:r>
+      <w:r>
+        <w:t>шаблонов), вед</w:t>
+      </w:r>
+      <w:r>
+        <w:rPr>
+          <w:rFonts w:hint="default"/>
+          <w:lang w:val="ru-RU"/>
+        </w:rPr>
+        <w:t>ё</w:t>
+      </w:r>
+      <w:r>
+        <w:t>т уч</w:t>
+      </w:r>
+      <w:r>
+        <w:rPr>
+          <w:lang w:val="ru-RU"/>
+        </w:rPr>
+        <w:t>ё</w:t>
+      </w:r>
+      <w:r>
+        <w:t>т кандидатов в реестре одобренных, планирует видеоинтервью с генерацией ссылок на встречи и фиксирует служебные заметки о профессиональных навыках соискателя.</w:t>
+      </w:r>
+    </w:p>
+    <w:p>
+      <w:pPr>
+        <w:keepNext w:val="0"/>
+        <w:keepLines w:val="0"/>
+        <w:pageBreakBefore w:val="0"/>
+        <w:widowControl/>
+        <w:kinsoku/>
+        <w:wordWrap/>
+        <w:overflowPunct/>
+        <w:topLinePunct w:val="0"/>
+        <w:autoSpaceDE/>
+        <w:autoSpaceDN/>
+        <w:bidi w:val="0"/>
+        <w:adjustRightInd/>
+        <w:snapToGrid/>
+        <w:spacing w:line="264" w:lineRule="auto"/>
+        <w:ind w:firstLine="706"/>
+        <w:textAlignment w:val="auto"/>
+      </w:pPr>
+      <w:r>
+        <w:t>Коммуникационный контур платформы обеспечивает двусторонний обмен сообщениями в реальном времени через специализированные чаты, привязанные к конкретным заявкам (откликам). Реализация системы призвана минимизировать рутинную нагрузку на HR-специалистов, стандартизировать воронку найма, исключить потерю кандидатов на промежуточных этапах и повысить общую оперативность подбора кадров.</w:t>
+      </w:r>
+    </w:p>
+    <w:p>
+      <w:pPr>
+        <w:pStyle w:val="3"/>
+        <w:keepNext/>
+        <w:keepLines w:val="0"/>
+        <w:pageBreakBefore w:val="0"/>
+        <w:widowControl/>
+        <w:kinsoku/>
+        <w:wordWrap/>
+        <w:overflowPunct/>
+        <w:topLinePunct w:val="0"/>
+        <w:autoSpaceDE/>
+        <w:autoSpaceDN/>
+        <w:bidi w:val="0"/>
+        <w:adjustRightInd/>
+        <w:snapToGrid/>
+        <w:spacing w:before="360" w:after="120"/>
+        <w:ind w:firstLine="706"/>
+        <w:textAlignment w:val="auto"/>
+        <w:rPr/>
+      </w:pPr>
+      <w:r>
+        <w:t>1.2 Обзор аналогичных решений</w:t>
+      </w:r>
+    </w:p>
+    <w:p>
+      <w:pPr>
+        <w:pStyle w:val="4"/>
         <w:bidi w:val="0"/>
         <w:rPr/>
       </w:pPr>
       <w:r>
-        <w:t>Разработка веб-приложения «HireVich» («Рекрутинг») направлена на создание универсальной онлайн-платформы для комплексной автоматизации и сквозного контроля процесса взаимодействия между соискателями (кандидатами) и специалистами по подбору персонала (рекрутерами).</w:t>
-      </w:r>
-    </w:p>
-    <w:p>
-      <w:pPr>
+        <w:t>1.2.1 Обзор ATS-платформы «Huntflow» (Хантфлоу)</w:t>
+      </w:r>
+    </w:p>
+    <w:p>
+      <w:pPr>
+        <w:keepNext w:val="0"/>
+        <w:keepLines w:val="0"/>
+        <w:pageBreakBefore w:val="0"/>
+        <w:widowControl/>
+        <w:kinsoku/>
+        <w:wordWrap/>
+        <w:overflowPunct/>
+        <w:topLinePunct w:val="0"/>
+        <w:autoSpaceDE/>
+        <w:autoSpaceDN/>
+        <w:bidi w:val="0"/>
+        <w:adjustRightInd/>
+        <w:snapToGrid/>
+        <w:spacing w:line="264" w:lineRule="auto"/>
+        <w:ind w:left="0" w:leftChars="0" w:firstLine="706" w:firstLineChars="0"/>
+        <w:textAlignment w:val="auto"/>
+        <w:rPr>
+          <w:lang w:eastAsia="ru-RU"/>
+        </w:rPr>
+      </w:pPr>
+      <w:r>
+        <w:t>Huntflow</w:t>
+      </w:r>
+      <w:r>
+        <w:rPr>
+          <w:rFonts w:hint="default"/>
+          <w:lang w:val="en-US"/>
+        </w:rPr>
+        <w:t>[2]</w:t>
+      </w:r>
+      <w:r>
+        <w:t xml:space="preserve"> — одна из ведущих коммерческих систем управления подбором персонала (Applicant Tracking System, ATS), предназначенная для автоматизации рекрутинга в корпоративном секторе. Платформа агрегирует базу резюме, позволяет настраивать этапы подбора и вести аналитику по воронке найма через веб-интерфейс.</w:t>
+      </w:r>
+      <w:r>
+        <w:rPr>
+          <w:rFonts w:hint="default"/>
+          <w:lang w:val="en-US"/>
+        </w:rPr>
+        <w:t xml:space="preserve"> </w:t>
+      </w:r>
+      <w:r>
+        <w:rPr>
+          <w:lang w:eastAsia="ru-RU"/>
+        </w:rPr>
+        <w:t xml:space="preserve">На рисунке 1.1 представлен интерфейс платформы </w:t>
+      </w:r>
+      <w:r>
+        <w:rPr>
+          <w:rFonts w:hint="default"/>
+          <w:lang w:val="en-US" w:eastAsia="ru-RU"/>
+        </w:rPr>
+        <w:t>Huntflow</w:t>
+      </w:r>
+      <w:r>
+        <w:rPr>
+          <w:lang w:eastAsia="ru-RU"/>
+        </w:rPr>
+        <w:t>.</w:t>
+      </w:r>
+    </w:p>
+    <w:p>
+      <w:pPr>
+        <w:pStyle w:val="17"/>
+        <w:pBdr>
+          <w:top w:val="none" w:color="auto" w:sz="0" w:space="0"/>
+          <w:left w:val="none" w:color="auto" w:sz="0" w:space="0"/>
+          <w:bottom w:val="none" w:color="auto" w:sz="0" w:space="0"/>
+          <w:right w:val="none" w:color="auto" w:sz="0" w:space="0"/>
+        </w:pBdr>
+        <w:bidi w:val="0"/>
+      </w:pPr>
+      <w:r>
+        <w:rPr>
+          <w:bdr w:val="single" w:sz="4" w:space="0"/>
+        </w:rPr>
+        <w:drawing>
+          <wp:inline distT="0" distB="0" distL="114300" distR="114300">
+            <wp:extent cx="4300855" cy="2306320"/>
+            <wp:effectExtent l="0" t="0" r="4445" b="17780"/>
+            <wp:docPr id="4" name="Изображение 1"/>
+            <wp:cNvGraphicFramePr>
+              <a:graphicFrameLocks xmlns:a="http://schemas.openxmlformats.org/drawingml/2006/main" noChangeAspect="1"/>
+            </wp:cNvGraphicFramePr>
+            <a:graphic xmlns:a="http://schemas.openxmlformats.org/drawingml/2006/main">
+              <a:graphicData uri="http://schemas.openxmlformats.org/drawingml/2006/picture">
+                <pic:pic xmlns:pic="http://schemas.openxmlformats.org/drawingml/2006/picture">
+                  <pic:nvPicPr>
+                    <pic:cNvPr id="4" name="Изображение 1"/>
+                    <pic:cNvPicPr>
+                      <a:picLocks noChangeAspect="1"/>
+                    </pic:cNvPicPr>
+                  </pic:nvPicPr>
+                  <pic:blipFill>
+                    <a:blip r:embed="rId6"/>
+                    <a:stretch>
+                      <a:fillRect/>
+                    </a:stretch>
+                  </pic:blipFill>
+                  <pic:spPr>
+                    <a:xfrm>
+                      <a:off x="0" y="0"/>
+                      <a:ext cx="4300855" cy="2306320"/>
+                    </a:xfrm>
+                    <a:prstGeom prst="rect">
+                      <a:avLst/>
+                    </a:prstGeom>
+                    <a:noFill/>
+                    <a:ln>
+                      <a:noFill/>
+                    </a:ln>
+                  </pic:spPr>
+                </pic:pic>
+              </a:graphicData>
+            </a:graphic>
+          </wp:inline>
+        </w:drawing>
+      </w:r>
+    </w:p>
+    <w:p>
+      <w:pPr>
+        <w:pStyle w:val="16"/>
+        <w:rPr>
+          <w:rFonts w:hint="default"/>
+          <w:lang w:val="en-US" w:eastAsia="ru-RU"/>
+        </w:rPr>
+      </w:pPr>
+      <w:r>
+        <w:rPr>
+          <w:lang w:eastAsia="ru-RU"/>
+        </w:rPr>
+        <w:t xml:space="preserve">Рисунок 1.1 – Интерфейс платформы </w:t>
+      </w:r>
+      <w:r>
+        <w:t>«</w:t>
+      </w:r>
+      <w:r>
+        <w:rPr>
+          <w:rFonts w:hint="default"/>
+          <w:lang w:val="en-US"/>
+        </w:rPr>
+        <w:t>Huntflow</w:t>
+      </w:r>
+      <w:r>
+        <w:t>»</w:t>
+      </w:r>
+    </w:p>
+    <w:p>
+      <w:pPr>
+        <w:ind w:left="0" w:leftChars="0" w:firstLine="708" w:firstLineChars="0"/>
+        <w:rPr/>
+      </w:pPr>
+      <w:r>
+        <w:t>Достоинства:</w:t>
+      </w:r>
+    </w:p>
+    <w:p>
+      <w:pPr>
+        <w:keepNext w:val="0"/>
+        <w:keepLines w:val="0"/>
+        <w:pageBreakBefore w:val="0"/>
+        <w:widowControl/>
+        <w:numPr>
+          <w:ilvl w:val="0"/>
+          <w:numId w:val="2"/>
+        </w:numPr>
+        <w:tabs>
+          <w:tab w:val="clear" w:pos="418"/>
+        </w:tabs>
+        <w:kinsoku/>
+        <w:wordWrap/>
+        <w:overflowPunct/>
+        <w:topLinePunct w:val="0"/>
+        <w:autoSpaceDE/>
+        <w:autoSpaceDN/>
+        <w:bidi w:val="0"/>
+        <w:adjustRightInd/>
+        <w:snapToGrid/>
+        <w:ind w:left="0" w:leftChars="0" w:firstLine="709" w:firstLineChars="0"/>
+        <w:textAlignment w:val="auto"/>
+        <w:rPr/>
+      </w:pPr>
+      <w:r>
+        <w:t>развитый контур управления воронкой кандидатов и гибкая настройка</w:t>
+      </w:r>
+      <w:r>
+        <w:rPr>
+          <w:rFonts w:hint="default"/>
+          <w:lang w:val="en-US"/>
+        </w:rPr>
+        <w:t xml:space="preserve"> </w:t>
+      </w:r>
+      <w:r>
+        <w:t>стадий подбора;</w:t>
+      </w:r>
+    </w:p>
+    <w:p>
+      <w:pPr>
+        <w:numPr>
+          <w:ilvl w:val="0"/>
+          <w:numId w:val="3"/>
+        </w:numPr>
+        <w:ind w:left="0" w:leftChars="0" w:firstLine="709" w:firstLineChars="0"/>
+        <w:rPr/>
+      </w:pPr>
+      <w:r>
+        <w:t>сохранение истории взаимодействия с соискателями, включая ведение внутренних заметок и тегов;</w:t>
+      </w:r>
+    </w:p>
+    <w:p>
+      <w:pPr>
+        <w:numPr>
+          <w:ilvl w:val="0"/>
+          <w:numId w:val="3"/>
+        </w:numPr>
+        <w:ind w:left="0" w:leftChars="0" w:firstLine="709" w:firstLineChars="0"/>
+        <w:rPr/>
+      </w:pPr>
+      <w:r>
+        <w:t>интеграция со сторонними календарями для планирования собеседований;</w:t>
+      </w:r>
+    </w:p>
+    <w:p>
+      <w:pPr>
+        <w:numPr>
+          <w:ilvl w:val="0"/>
+          <w:numId w:val="3"/>
+        </w:numPr>
+        <w:ind w:left="0" w:leftChars="0" w:firstLine="709" w:firstLineChars="0"/>
+        <w:rPr/>
+      </w:pPr>
+      <w:r>
+        <w:t>централизованный сбор откликов из различных внешних источников.</w:t>
+      </w:r>
+    </w:p>
+    <w:p>
+      <w:pPr>
+        <w:ind w:left="0" w:leftChars="0" w:firstLine="708" w:firstLineChars="0"/>
+        <w:rPr/>
+      </w:pPr>
+      <w:r>
+        <w:t>Недостатки Huntflow по сравнению с разрабатываемым решением:</w:t>
+      </w:r>
+    </w:p>
+    <w:p>
+      <w:pPr>
+        <w:numPr>
+          <w:ilvl w:val="0"/>
+          <w:numId w:val="3"/>
+        </w:numPr>
+        <w:ind w:left="0" w:leftChars="0" w:firstLine="709" w:firstLineChars="0"/>
+        <w:rPr/>
+      </w:pPr>
+      <w:r>
+        <w:t>ориентированность на внутреннее использование рекрутерами; соискатели не имеют личного кабинета внутри системы для отслеживания своего прогресса;</w:t>
+      </w:r>
+    </w:p>
+    <w:p>
+      <w:pPr>
+        <w:numPr>
+          <w:ilvl w:val="0"/>
+          <w:numId w:val="3"/>
+        </w:numPr>
+        <w:ind w:left="0" w:leftChars="0" w:firstLine="709" w:firstLineChars="0"/>
+        <w:rPr/>
+      </w:pPr>
+      <w:r>
+        <w:t xml:space="preserve">коммуникация с кандидатами вынесена во внешние каналы (Email, мессенджеры), в то время как проект «HireVich» требует наличия встроенного чата реального времени, </w:t>
+      </w:r>
+      <w:r>
+        <w:rPr>
+          <w:lang w:val="ru-RU"/>
+        </w:rPr>
+        <w:t>жёстко</w:t>
+      </w:r>
+      <w:r>
+        <w:t xml:space="preserve"> привязанного к заявке;</w:t>
+      </w:r>
+    </w:p>
+    <w:p>
+      <w:pPr>
+        <w:numPr>
+          <w:ilvl w:val="0"/>
+          <w:numId w:val="3"/>
+        </w:numPr>
+        <w:ind w:left="0" w:leftChars="0" w:firstLine="709" w:firstLineChars="0"/>
+      </w:pPr>
+      <w:r>
+        <w:t>высокая стоимость лицензирования и закрытая архитектура, исключающая кастомизацию под специфические локальные нужды организации без согласования с вендором.</w:t>
+      </w:r>
+    </w:p>
+    <w:p>
+      <w:pPr>
+        <w:bidi w:val="0"/>
+      </w:pPr>
+      <w:r>
+        <w:t>Таким образом, платформа Huntflow представляет собой мощный корпоративный инструмент для внутренней аналитики HR-департаментов. Однако изолированность соискателя от процесса отбора и отсутствие сквозного real-time взаимодействия внутри единого интерфейса делают данную систему избыточной и экономически неэффективной для локального использования в рамках узкоспециализированных ИТ-экосистем. Извлеченный опыт организации воронки подбора целесообразно использовать при проектировании серверной логики базы данных «HireVich».</w:t>
+      </w:r>
+    </w:p>
+    <w:p>
+      <w:pPr>
+        <w:pStyle w:val="4"/>
+        <w:keepNext w:val="0"/>
+        <w:keepLines w:val="0"/>
+        <w:pageBreakBefore w:val="0"/>
+        <w:widowControl/>
+        <w:kinsoku/>
+        <w:wordWrap/>
+        <w:overflowPunct/>
+        <w:topLinePunct w:val="0"/>
+        <w:autoSpaceDE/>
+        <w:autoSpaceDN/>
+        <w:bidi w:val="0"/>
+        <w:adjustRightInd/>
+        <w:snapToGrid/>
+        <w:spacing w:before="360"/>
+        <w:ind w:left="0" w:leftChars="0" w:firstLine="708" w:firstLineChars="0"/>
+        <w:textAlignment w:val="auto"/>
+        <w:rPr/>
+      </w:pPr>
+      <w:r>
+        <w:t xml:space="preserve">1.2.2 Обзор облачного сервиса «TalentTech </w:t>
+      </w:r>
+      <w:r>
+        <w:rPr>
+          <w:rFonts w:hint="default"/>
+          <w:lang w:val="ru-RU"/>
+        </w:rPr>
+        <w:t>Консалтинг</w:t>
+      </w:r>
+      <w:r>
+        <w:t>»</w:t>
+      </w:r>
+    </w:p>
+    <w:p>
+      <w:pPr>
+        <w:numPr>
+          <w:numId w:val="0"/>
+        </w:numPr>
+        <w:tabs>
+          <w:tab w:val="left" w:pos="418"/>
+        </w:tabs>
+        <w:rPr>
+          <w:rFonts w:hint="default" w:ascii="Times New Roman" w:hAnsi="Times New Roman" w:eastAsia="Calibri" w:cs="Times New Roman"/>
+          <w:sz w:val="28"/>
+          <w:szCs w:val="28"/>
+        </w:rPr>
+      </w:pPr>
+      <w:r>
+        <w:rPr>
+          <w:rFonts w:hint="default"/>
+          <w:lang w:val="en-US"/>
+        </w:rPr>
+        <w:tab/>
+      </w:r>
+      <w:r>
+        <w:t xml:space="preserve">«TalentTech </w:t>
+      </w:r>
+      <w:r>
+        <w:rPr>
+          <w:rFonts w:hint="default"/>
+          <w:lang w:val="ru-RU"/>
+        </w:rPr>
+        <w:t>Консалтинг</w:t>
+      </w:r>
+      <w:r>
+        <w:t>»</w:t>
+      </w:r>
+      <w:r>
+        <w:rPr>
+          <w:rFonts w:hint="default"/>
+          <w:lang w:val="en-US"/>
+        </w:rPr>
+        <w:t>[3]</w:t>
+      </w:r>
+      <w:r>
+        <w:t xml:space="preserve"> представляет собой облачное решение для автоматизации рекрутинга, ориентированное на малый и средний бизнес. Система позволяет публиковать вакансии, вести базу кандидатов и организовывать совместную работу HR-команды.</w:t>
+      </w:r>
+      <w:r>
+        <w:rPr>
+          <w:rFonts w:hint="default"/>
+          <w:lang w:val="ru-RU"/>
+        </w:rPr>
+        <w:t xml:space="preserve"> </w:t>
+      </w:r>
+      <w:r>
+        <w:rPr>
+          <w:rFonts w:hint="default" w:ascii="Times New Roman" w:hAnsi="Times New Roman" w:eastAsia="Calibri" w:cs="Times New Roman"/>
+          <w:sz w:val="28"/>
+          <w:szCs w:val="28"/>
+        </w:rPr>
+        <w:t>На рисунке 1.</w:t>
+      </w:r>
+      <w:r>
+        <w:rPr>
+          <w:rFonts w:hint="default" w:ascii="Times New Roman" w:hAnsi="Times New Roman" w:eastAsia="Calibri" w:cs="Times New Roman"/>
+          <w:sz w:val="28"/>
+          <w:szCs w:val="28"/>
+          <w:lang w:val="ru-RU"/>
+        </w:rPr>
+        <w:t>2</w:t>
+      </w:r>
+      <w:r>
+        <w:rPr>
+          <w:rFonts w:hint="default" w:ascii="Times New Roman" w:hAnsi="Times New Roman" w:eastAsia="Calibri" w:cs="Times New Roman"/>
+          <w:sz w:val="28"/>
+          <w:szCs w:val="28"/>
+        </w:rPr>
+        <w:t xml:space="preserve"> представлен интерфейс платформы </w:t>
+      </w:r>
+      <w:r>
+        <w:rPr>
+          <w:sz w:val="28"/>
+          <w:szCs w:val="28"/>
+        </w:rPr>
+        <w:t xml:space="preserve">TalentTech </w:t>
+      </w:r>
+      <w:r>
+        <w:rPr>
+          <w:rFonts w:hint="default"/>
+          <w:sz w:val="28"/>
+          <w:szCs w:val="28"/>
+          <w:lang w:val="ru-RU"/>
+        </w:rPr>
+        <w:t>Консалтинг</w:t>
+      </w:r>
+      <w:r>
+        <w:rPr>
+          <w:rFonts w:hint="default" w:ascii="Times New Roman" w:hAnsi="Times New Roman" w:eastAsia="Calibri" w:cs="Times New Roman"/>
+          <w:sz w:val="28"/>
+          <w:szCs w:val="28"/>
+        </w:rPr>
+        <w:t>.</w:t>
+      </w:r>
+    </w:p>
+    <w:p>
+      <w:pPr>
+        <w:pStyle w:val="17"/>
+        <w:pBdr>
+          <w:top w:val="none" w:color="auto" w:sz="0" w:space="0"/>
+          <w:left w:val="none" w:color="auto" w:sz="0" w:space="0"/>
+          <w:bottom w:val="none" w:color="auto" w:sz="0" w:space="0"/>
+          <w:right w:val="none" w:color="auto" w:sz="0" w:space="0"/>
+        </w:pBdr>
+        <w:bidi w:val="0"/>
+      </w:pPr>
+      <w:r>
+        <w:rPr>
+          <w:bdr w:val="single" w:sz="4" w:space="0"/>
+        </w:rPr>
+        <w:drawing>
+          <wp:inline distT="0" distB="0" distL="114300" distR="114300">
+            <wp:extent cx="4550410" cy="2449830"/>
+            <wp:effectExtent l="0" t="0" r="2540" b="7620"/>
+            <wp:docPr id="6" name="Изображение 2"/>
+            <wp:cNvGraphicFramePr>
+              <a:graphicFrameLocks xmlns:a="http://schemas.openxmlformats.org/drawingml/2006/main" noChangeAspect="1"/>
+            </wp:cNvGraphicFramePr>
+            <a:graphic xmlns:a="http://schemas.openxmlformats.org/drawingml/2006/main">
+              <a:graphicData uri="http://schemas.openxmlformats.org/drawingml/2006/picture">
+                <pic:pic xmlns:pic="http://schemas.openxmlformats.org/drawingml/2006/picture">
+                  <pic:nvPicPr>
+                    <pic:cNvPr id="6" name="Изображение 2"/>
+                    <pic:cNvPicPr>
+                      <a:picLocks noChangeAspect="1"/>
+                    </pic:cNvPicPr>
+                  </pic:nvPicPr>
+                  <pic:blipFill>
+                    <a:blip r:embed="rId7"/>
+                    <a:stretch>
+                      <a:fillRect/>
+                    </a:stretch>
+                  </pic:blipFill>
+                  <pic:spPr>
+                    <a:xfrm>
+                      <a:off x="0" y="0"/>
+                      <a:ext cx="4550410" cy="2449830"/>
+                    </a:xfrm>
+                    <a:prstGeom prst="rect">
+                      <a:avLst/>
+                    </a:prstGeom>
+                    <a:noFill/>
+                    <a:ln>
+                      <a:noFill/>
+                    </a:ln>
+                  </pic:spPr>
+                </pic:pic>
+              </a:graphicData>
+            </a:graphic>
+          </wp:inline>
+        </w:drawing>
+      </w:r>
+    </w:p>
+    <w:p>
+      <w:pPr>
+        <w:pStyle w:val="16"/>
+        <w:rPr>
+          <w:rFonts w:hint="default" w:ascii="Times New Roman" w:hAnsi="Times New Roman" w:eastAsia="Calibri" w:cs="Times New Roman"/>
+          <w:sz w:val="24"/>
+          <w:szCs w:val="24"/>
+        </w:rPr>
+      </w:pPr>
+      <w:r>
+        <w:rPr>
+          <w:lang w:eastAsia="ru-RU"/>
+        </w:rPr>
+        <w:t>Рисунок 1.</w:t>
+      </w:r>
+      <w:r>
+        <w:rPr>
+          <w:rFonts w:hint="default"/>
+          <w:lang w:val="en-US" w:eastAsia="ru-RU"/>
+        </w:rPr>
+        <w:t>2</w:t>
+      </w:r>
+      <w:r>
+        <w:rPr>
+          <w:lang w:eastAsia="ru-RU"/>
+        </w:rPr>
+        <w:t xml:space="preserve"> – Интерфейс платформы </w:t>
+      </w:r>
+      <w:r>
+        <w:t xml:space="preserve">«TalentTech </w:t>
+      </w:r>
+      <w:r>
+        <w:rPr>
+          <w:rFonts w:hint="default"/>
+          <w:lang w:val="ru-RU"/>
+        </w:rPr>
+        <w:t>Консалтинг</w:t>
+      </w:r>
+      <w:r>
+        <w:t>»</w:t>
+      </w:r>
+    </w:p>
+    <w:p>
+      <w:pPr>
+        <w:keepNext w:val="0"/>
+        <w:keepLines w:val="0"/>
+        <w:pageBreakBefore w:val="0"/>
+        <w:widowControl/>
+        <w:numPr>
+          <w:numId w:val="0"/>
+        </w:numPr>
+        <w:tabs>
+          <w:tab w:val="left" w:pos="418"/>
+        </w:tabs>
+        <w:kinsoku/>
+        <w:wordWrap/>
+        <w:overflowPunct/>
+        <w:topLinePunct w:val="0"/>
+        <w:autoSpaceDE/>
+        <w:autoSpaceDN/>
+        <w:bidi w:val="0"/>
+        <w:adjustRightInd/>
+        <w:snapToGrid/>
+        <w:ind w:firstLine="709"/>
+        <w:textAlignment w:val="auto"/>
+        <w:rPr/>
+      </w:pPr>
+      <w:r>
+        <w:t>Достоинства:</w:t>
+      </w:r>
+    </w:p>
+    <w:p>
+      <w:pPr>
+        <w:keepNext w:val="0"/>
+        <w:keepLines w:val="0"/>
+        <w:pageBreakBefore w:val="0"/>
+        <w:widowControl/>
+        <w:numPr>
+          <w:ilvl w:val="0"/>
+          <w:numId w:val="3"/>
+        </w:numPr>
+        <w:kinsoku/>
+        <w:wordWrap/>
+        <w:overflowPunct/>
+        <w:topLinePunct w:val="0"/>
+        <w:autoSpaceDE/>
+        <w:autoSpaceDN/>
+        <w:bidi w:val="0"/>
+        <w:adjustRightInd/>
+        <w:snapToGrid/>
+        <w:ind w:left="0" w:leftChars="0" w:firstLine="709" w:firstLineChars="0"/>
+        <w:textAlignment w:val="auto"/>
+        <w:rPr/>
+      </w:pPr>
+      <w:r>
+        <w:t>доступ через веб-интерфейс без необходимости разв</w:t>
+      </w:r>
+      <w:r>
+        <w:rPr>
+          <w:rFonts w:hint="default"/>
+          <w:lang w:val="ru-RU"/>
+        </w:rPr>
+        <w:t>ё</w:t>
+      </w:r>
+      <w:r>
+        <w:t>ртывания локальной инфраструктуры;</w:t>
+      </w:r>
+    </w:p>
+    <w:p>
+      <w:pPr>
+        <w:keepNext w:val="0"/>
+        <w:keepLines w:val="0"/>
+        <w:pageBreakBefore w:val="0"/>
+        <w:widowControl/>
+        <w:numPr>
+          <w:ilvl w:val="0"/>
+          <w:numId w:val="3"/>
+        </w:numPr>
+        <w:kinsoku/>
+        <w:wordWrap/>
+        <w:overflowPunct/>
+        <w:topLinePunct w:val="0"/>
+        <w:autoSpaceDE/>
+        <w:autoSpaceDN/>
+        <w:bidi w:val="0"/>
+        <w:adjustRightInd/>
+        <w:snapToGrid/>
+        <w:ind w:left="0" w:leftChars="0" w:firstLine="709" w:firstLineChars="0"/>
+        <w:textAlignment w:val="auto"/>
+        <w:rPr/>
+      </w:pPr>
+      <w:r>
+        <w:t>поддержка ролевой модели (руководитель, рекрутер, заказчик) с разграничением прав видимости вакансий;</w:t>
+      </w:r>
+    </w:p>
+    <w:p>
+      <w:pPr>
+        <w:keepNext w:val="0"/>
+        <w:keepLines w:val="0"/>
+        <w:pageBreakBefore w:val="0"/>
+        <w:widowControl/>
+        <w:numPr>
+          <w:ilvl w:val="0"/>
+          <w:numId w:val="3"/>
+        </w:numPr>
+        <w:kinsoku/>
+        <w:wordWrap/>
+        <w:overflowPunct/>
+        <w:topLinePunct w:val="0"/>
+        <w:autoSpaceDE/>
+        <w:autoSpaceDN/>
+        <w:bidi w:val="0"/>
+        <w:adjustRightInd/>
+        <w:snapToGrid/>
+        <w:ind w:left="0" w:leftChars="0" w:firstLine="709" w:firstLineChars="0"/>
+        <w:textAlignment w:val="auto"/>
+        <w:rPr/>
+      </w:pPr>
+      <w:r>
+        <w:t>наличие инструментов для оценки кандидатов и ведения внутренней базы одобренных специалистов;</w:t>
+      </w:r>
+    </w:p>
+    <w:p>
+      <w:pPr>
+        <w:keepNext w:val="0"/>
+        <w:keepLines w:val="0"/>
+        <w:pageBreakBefore w:val="0"/>
+        <w:widowControl/>
+        <w:numPr>
+          <w:ilvl w:val="0"/>
+          <w:numId w:val="3"/>
+        </w:numPr>
+        <w:kinsoku/>
+        <w:wordWrap/>
+        <w:overflowPunct/>
+        <w:topLinePunct w:val="0"/>
+        <w:autoSpaceDE/>
+        <w:autoSpaceDN/>
+        <w:bidi w:val="0"/>
+        <w:adjustRightInd/>
+        <w:snapToGrid/>
+        <w:ind w:left="0" w:leftChars="0" w:firstLine="709" w:firstLineChars="0"/>
+        <w:textAlignment w:val="auto"/>
+        <w:rPr/>
+      </w:pPr>
+      <w:r>
+        <w:t>интуитивно понятный интерфейс карточек кандидатов и вакансий.</w:t>
+      </w:r>
+    </w:p>
+    <w:p>
+      <w:pPr>
+        <w:keepNext w:val="0"/>
+        <w:keepLines w:val="0"/>
+        <w:pageBreakBefore w:val="0"/>
+        <w:widowControl/>
+        <w:numPr>
+          <w:numId w:val="0"/>
+        </w:numPr>
+        <w:tabs>
+          <w:tab w:val="left" w:pos="418"/>
+        </w:tabs>
+        <w:kinsoku/>
+        <w:wordWrap/>
+        <w:overflowPunct/>
+        <w:topLinePunct w:val="0"/>
+        <w:autoSpaceDE/>
+        <w:autoSpaceDN/>
+        <w:bidi w:val="0"/>
+        <w:adjustRightInd/>
+        <w:snapToGrid/>
+        <w:ind w:firstLine="709"/>
+        <w:textAlignment w:val="auto"/>
+        <w:rPr/>
+      </w:pPr>
+      <w:r>
+        <w:t>Недостатки:</w:t>
+      </w:r>
+    </w:p>
+    <w:p>
+      <w:pPr>
+        <w:keepNext w:val="0"/>
+        <w:keepLines w:val="0"/>
+        <w:pageBreakBefore w:val="0"/>
+        <w:widowControl/>
+        <w:numPr>
+          <w:ilvl w:val="0"/>
+          <w:numId w:val="3"/>
+        </w:numPr>
+        <w:kinsoku/>
+        <w:wordWrap/>
+        <w:overflowPunct/>
+        <w:topLinePunct w:val="0"/>
+        <w:autoSpaceDE/>
+        <w:autoSpaceDN/>
+        <w:bidi w:val="0"/>
+        <w:adjustRightInd/>
+        <w:snapToGrid/>
+        <w:ind w:left="0" w:leftChars="0" w:firstLine="709" w:firstLineChars="0"/>
+        <w:textAlignment w:val="auto"/>
+        <w:rPr/>
+      </w:pPr>
+      <w:r>
+        <w:t>коммуникация между рекрутером и кандидатом не централизована «в одном окне» веб-приложения;</w:t>
+      </w:r>
+    </w:p>
+    <w:p>
+      <w:pPr>
+        <w:keepNext w:val="0"/>
+        <w:keepLines w:val="0"/>
+        <w:pageBreakBefore w:val="0"/>
+        <w:widowControl/>
+        <w:numPr>
+          <w:ilvl w:val="0"/>
+          <w:numId w:val="3"/>
+        </w:numPr>
+        <w:kinsoku/>
+        <w:wordWrap/>
+        <w:overflowPunct/>
+        <w:topLinePunct w:val="0"/>
+        <w:autoSpaceDE/>
+        <w:autoSpaceDN/>
+        <w:bidi w:val="0"/>
+        <w:adjustRightInd/>
+        <w:snapToGrid/>
+        <w:ind w:left="0" w:leftChars="0" w:firstLine="709" w:firstLineChars="0"/>
+        <w:textAlignment w:val="auto"/>
+        <w:rPr>
+          <w:rFonts w:hint="default"/>
+          <w:lang w:val="ru-RU"/>
+        </w:rPr>
+      </w:pPr>
+      <w:r>
+        <w:t>ж</w:t>
+      </w:r>
+      <w:r>
+        <w:rPr>
+          <w:lang w:val="ru-RU"/>
+        </w:rPr>
+        <w:t>ё</w:t>
+      </w:r>
+      <w:r>
+        <w:t>стко заданная структура шаблонов подбора, не позволяющая динамически перестраивать чек-листы прогресса со стороны рекрутера на уровне конкретной вакансии так, как это заложено в архитектуре «HireVich».</w:t>
+      </w:r>
+    </w:p>
+    <w:p>
+      <w:pPr>
+        <w:bidi w:val="0"/>
+        <w:rPr>
+          <w:rFonts w:hint="default"/>
+          <w:lang w:val="ru-RU"/>
+        </w:rPr>
+      </w:pPr>
+      <w:r>
+        <w:rPr>
+          <w:rFonts w:hint="default"/>
+          <w:lang w:val="ru-RU"/>
+        </w:rPr>
+        <w:t>Рассмотренный программный продукт наглядно демонстрирует преимущества минималистичного веб-интерфейса и важность чёткого разграничения пользовательских ролей. Тем не менее, жёсткие рамки SaaS-модели (Software as a Service)</w:t>
+      </w:r>
+      <w:r>
+        <w:rPr>
+          <w:rFonts w:hint="default"/>
+          <w:lang w:val="en-US"/>
+        </w:rPr>
+        <w:t>[4]</w:t>
+      </w:r>
+      <w:r>
+        <w:rPr>
+          <w:rFonts w:hint="default"/>
+          <w:lang w:val="ru-RU"/>
+        </w:rPr>
+        <w:t xml:space="preserve"> и отсутствие гибких инструментов динамического конструирования чек-листов под уникальные вакансии ограничивают адаптацию системы под изменчивые внутренние бизнес-процессы. Данный недостаток будет устранён в разрабатываемом приложении за счёт реализации кастомных и глобальных шаблонов этапов отбора</w:t>
+      </w:r>
+    </w:p>
+    <w:p>
+      <w:pPr>
+        <w:bidi w:val="0"/>
+        <w:rPr>
+          <w:rFonts w:hint="default"/>
+          <w:lang w:val="ru-RU"/>
+        </w:rPr>
+      </w:pPr>
+    </w:p>
+    <w:p>
+      <w:pPr>
+        <w:bidi w:val="0"/>
+        <w:ind w:left="0" w:leftChars="0" w:firstLine="0" w:firstLineChars="0"/>
+        <w:rPr>
+          <w:rFonts w:hint="default"/>
+          <w:lang w:val="ru-RU"/>
+        </w:rPr>
+      </w:pPr>
+    </w:p>
+    <w:p>
+      <w:pPr>
+        <w:pStyle w:val="4"/>
+        <w:keepNext w:val="0"/>
+        <w:keepLines w:val="0"/>
+        <w:pageBreakBefore w:val="0"/>
+        <w:widowControl/>
+        <w:kinsoku/>
+        <w:wordWrap/>
+        <w:overflowPunct/>
+        <w:topLinePunct w:val="0"/>
+        <w:autoSpaceDE/>
+        <w:autoSpaceDN/>
+        <w:bidi w:val="0"/>
+        <w:adjustRightInd/>
+        <w:snapToGrid/>
+        <w:spacing w:before="360"/>
+        <w:ind w:firstLine="706"/>
+        <w:textAlignment w:val="auto"/>
+        <w:rPr>
+          <w:rFonts w:hint="default"/>
+          <w:lang w:val="ru-RU"/>
+        </w:rPr>
+      </w:pPr>
+      <w:r>
+        <w:rPr>
+          <w:rFonts w:hint="default"/>
+          <w:lang w:val="ru-RU"/>
+        </w:rPr>
+        <w:t>1.2.3 Обзор специализированного интернет-ресурса «rabota.by»</w:t>
+      </w:r>
+    </w:p>
+    <w:p>
+      <w:pPr>
+        <w:numPr>
+          <w:ilvl w:val="0"/>
+          <w:numId w:val="0"/>
+        </w:numPr>
+        <w:tabs>
+          <w:tab w:val="left" w:pos="418"/>
+        </w:tabs>
+        <w:rPr>
+          <w:rFonts w:hint="default" w:ascii="Times New Roman" w:hAnsi="Times New Roman" w:eastAsia="Calibri" w:cs="Times New Roman"/>
+          <w:sz w:val="28"/>
+          <w:szCs w:val="28"/>
+        </w:rPr>
+      </w:pPr>
+      <w:r>
+        <w:rPr>
+          <w:rFonts w:hint="default"/>
+          <w:lang w:val="ru-RU"/>
+        </w:rPr>
+        <w:t>Платформа rabota.by</w:t>
+      </w:r>
+      <w:r>
+        <w:rPr>
+          <w:rFonts w:hint="default"/>
+          <w:lang w:val="en-US"/>
+        </w:rPr>
+        <w:t>[5]</w:t>
+      </w:r>
+      <w:r>
+        <w:rPr>
+          <w:rFonts w:hint="default"/>
+          <w:lang w:val="ru-RU"/>
+        </w:rPr>
+        <w:t xml:space="preserve"> (входит в группу компаний HeadHunter) является крупнейшим в Республике Беларусь специализированным веб-ресурсом общего назначения для поиска работы и подбора персонала. Сервис функционирует как глобальный двусторонний маркетплейс, аккумулирующий миллионы резюме и десятки тысяч вакансий в различных профессиональных областях.</w:t>
+      </w:r>
+      <w:r>
+        <w:rPr>
+          <w:rFonts w:hint="default"/>
+          <w:lang w:val="en-US"/>
+        </w:rPr>
+        <w:t xml:space="preserve"> </w:t>
+      </w:r>
+      <w:r>
+        <w:rPr>
+          <w:rFonts w:hint="default" w:ascii="Times New Roman" w:hAnsi="Times New Roman" w:eastAsia="Calibri" w:cs="Times New Roman"/>
+          <w:sz w:val="28"/>
+          <w:szCs w:val="28"/>
+        </w:rPr>
+        <w:t>На рисунке 1.</w:t>
+      </w:r>
+      <w:r>
+        <w:rPr>
+          <w:rFonts w:hint="default" w:ascii="Times New Roman" w:hAnsi="Times New Roman" w:eastAsia="Calibri" w:cs="Times New Roman"/>
+          <w:sz w:val="28"/>
+          <w:szCs w:val="28"/>
+          <w:lang w:val="en-US"/>
+        </w:rPr>
+        <w:t>3</w:t>
+      </w:r>
+      <w:r>
+        <w:rPr>
+          <w:rFonts w:hint="default" w:ascii="Times New Roman" w:hAnsi="Times New Roman" w:eastAsia="Calibri" w:cs="Times New Roman"/>
+          <w:sz w:val="28"/>
+          <w:szCs w:val="28"/>
+        </w:rPr>
+        <w:t xml:space="preserve"> представлен интерфейс платформы </w:t>
+      </w:r>
+      <w:r>
+        <w:rPr>
+          <w:rFonts w:hint="default"/>
+          <w:sz w:val="28"/>
+          <w:szCs w:val="28"/>
+          <w:lang w:val="en-US"/>
+        </w:rPr>
+        <w:t>rabota.by</w:t>
+      </w:r>
+      <w:r>
+        <w:rPr>
+          <w:rFonts w:hint="default" w:ascii="Times New Roman" w:hAnsi="Times New Roman" w:eastAsia="Calibri" w:cs="Times New Roman"/>
+          <w:sz w:val="28"/>
+          <w:szCs w:val="28"/>
+        </w:rPr>
+        <w:t>.</w:t>
+      </w:r>
+    </w:p>
+    <w:p>
+      <w:pPr>
+        <w:pStyle w:val="17"/>
+        <w:pBdr>
+          <w:top w:val="none" w:color="auto" w:sz="0" w:space="0"/>
+          <w:left w:val="none" w:color="auto" w:sz="0" w:space="0"/>
+          <w:bottom w:val="none" w:color="auto" w:sz="0" w:space="0"/>
+          <w:right w:val="none" w:color="auto" w:sz="0" w:space="0"/>
+        </w:pBdr>
+        <w:bidi w:val="0"/>
+      </w:pPr>
+      <w:r>
+        <w:rPr>
+          <w:bdr w:val="single" w:sz="4" w:space="0"/>
+        </w:rPr>
+        <w:drawing>
+          <wp:inline distT="0" distB="0" distL="114300" distR="114300">
+            <wp:extent cx="5930265" cy="2967990"/>
+            <wp:effectExtent l="0" t="0" r="13335" b="3810"/>
+            <wp:docPr id="8" name="Изображение 3"/>
+            <wp:cNvGraphicFramePr>
+              <a:graphicFrameLocks xmlns:a="http://schemas.openxmlformats.org/drawingml/2006/main" noChangeAspect="1"/>
+            </wp:cNvGraphicFramePr>
+            <a:graphic xmlns:a="http://schemas.openxmlformats.org/drawingml/2006/main">
+              <a:graphicData uri="http://schemas.openxmlformats.org/drawingml/2006/picture">
+                <pic:pic xmlns:pic="http://schemas.openxmlformats.org/drawingml/2006/picture">
+                  <pic:nvPicPr>
+                    <pic:cNvPr id="8" name="Изображение 3"/>
+                    <pic:cNvPicPr>
+                      <a:picLocks noChangeAspect="1"/>
+                    </pic:cNvPicPr>
+                  </pic:nvPicPr>
+                  <pic:blipFill>
+                    <a:blip r:embed="rId8"/>
+                    <a:stretch>
+                      <a:fillRect/>
+                    </a:stretch>
+                  </pic:blipFill>
+                  <pic:spPr>
+                    <a:xfrm>
+                      <a:off x="0" y="0"/>
+                      <a:ext cx="5930265" cy="2967990"/>
+                    </a:xfrm>
+                    <a:prstGeom prst="rect">
+                      <a:avLst/>
+                    </a:prstGeom>
+                    <a:noFill/>
+                    <a:ln>
+                      <a:noFill/>
+                    </a:ln>
+                  </pic:spPr>
+                </pic:pic>
+              </a:graphicData>
+            </a:graphic>
+          </wp:inline>
+        </w:drawing>
+      </w:r>
+    </w:p>
+    <w:p>
+      <w:pPr>
+        <w:pStyle w:val="16"/>
+        <w:rPr>
+          <w:rFonts w:hint="default" w:ascii="Times New Roman" w:hAnsi="Times New Roman" w:eastAsia="Calibri" w:cs="Times New Roman"/>
+          <w:sz w:val="28"/>
+          <w:szCs w:val="28"/>
+          <w:lang w:val="en-US"/>
+        </w:rPr>
+      </w:pPr>
+      <w:r>
+        <w:rPr>
+          <w:lang w:eastAsia="ru-RU"/>
+        </w:rPr>
+        <w:t>Рисунок 1.</w:t>
+      </w:r>
+      <w:r>
+        <w:rPr>
+          <w:rFonts w:hint="default"/>
+          <w:lang w:val="en-US" w:eastAsia="ru-RU"/>
+        </w:rPr>
+        <w:t>3</w:t>
+      </w:r>
+      <w:r>
+        <w:rPr>
+          <w:lang w:eastAsia="ru-RU"/>
+        </w:rPr>
+        <w:t xml:space="preserve"> – Интерфейс платформы </w:t>
+      </w:r>
+      <w:r>
+        <w:t>«</w:t>
+      </w:r>
+      <w:r>
+        <w:rPr>
+          <w:rFonts w:hint="default"/>
+          <w:lang w:val="en-US"/>
+        </w:rPr>
+        <w:t>Rabota.by</w:t>
+      </w:r>
+      <w:r>
+        <w:t>»</w:t>
+      </w:r>
+    </w:p>
+    <w:p>
+      <w:pPr>
+        <w:keepNext w:val="0"/>
+        <w:keepLines w:val="0"/>
+        <w:pageBreakBefore w:val="0"/>
+        <w:widowControl/>
+        <w:kinsoku/>
+        <w:wordWrap/>
+        <w:overflowPunct/>
+        <w:topLinePunct w:val="0"/>
+        <w:autoSpaceDE/>
+        <w:autoSpaceDN/>
+        <w:bidi w:val="0"/>
+        <w:adjustRightInd/>
+        <w:snapToGrid/>
+        <w:spacing w:line="228" w:lineRule="auto"/>
+        <w:ind w:firstLine="706"/>
+        <w:textAlignment w:val="auto"/>
+        <w:rPr>
+          <w:rFonts w:hint="default"/>
+          <w:lang w:val="ru-RU"/>
+        </w:rPr>
+      </w:pPr>
+      <w:r>
+        <w:rPr>
+          <w:rFonts w:hint="default"/>
+          <w:lang w:val="ru-RU"/>
+        </w:rPr>
+        <w:t>Достоинства:</w:t>
+      </w:r>
+    </w:p>
+    <w:p>
+      <w:pPr>
+        <w:keepNext w:val="0"/>
+        <w:keepLines w:val="0"/>
+        <w:pageBreakBefore w:val="0"/>
+        <w:widowControl/>
+        <w:numPr>
+          <w:ilvl w:val="0"/>
+          <w:numId w:val="4"/>
+        </w:numPr>
+        <w:kinsoku/>
+        <w:wordWrap/>
+        <w:overflowPunct/>
+        <w:topLinePunct w:val="0"/>
+        <w:autoSpaceDE/>
+        <w:autoSpaceDN/>
+        <w:bidi w:val="0"/>
+        <w:adjustRightInd/>
+        <w:snapToGrid/>
+        <w:spacing w:line="228" w:lineRule="auto"/>
+        <w:ind w:left="0" w:leftChars="0" w:firstLine="706" w:firstLineChars="0"/>
+        <w:textAlignment w:val="auto"/>
+        <w:rPr>
+          <w:rFonts w:hint="default"/>
+          <w:lang w:val="ru-RU"/>
+        </w:rPr>
+      </w:pPr>
+      <w:r>
+        <w:rPr>
+          <w:rFonts w:hint="default"/>
+          <w:lang w:val="ru-RU"/>
+        </w:rPr>
+        <w:t>огромный охват аудитории соискателей и нанимателей в рамках единого гео-пространства;</w:t>
+      </w:r>
+    </w:p>
+    <w:p>
+      <w:pPr>
+        <w:keepNext w:val="0"/>
+        <w:keepLines w:val="0"/>
+        <w:pageBreakBefore w:val="0"/>
+        <w:widowControl/>
+        <w:numPr>
+          <w:ilvl w:val="0"/>
+          <w:numId w:val="4"/>
+        </w:numPr>
+        <w:kinsoku/>
+        <w:wordWrap/>
+        <w:overflowPunct/>
+        <w:topLinePunct w:val="0"/>
+        <w:autoSpaceDE/>
+        <w:autoSpaceDN/>
+        <w:bidi w:val="0"/>
+        <w:adjustRightInd/>
+        <w:snapToGrid/>
+        <w:spacing w:line="228" w:lineRule="auto"/>
+        <w:ind w:left="0" w:leftChars="0" w:firstLine="706" w:firstLineChars="0"/>
+        <w:textAlignment w:val="auto"/>
+        <w:rPr>
+          <w:rFonts w:hint="default"/>
+          <w:lang w:val="ru-RU"/>
+        </w:rPr>
+      </w:pPr>
+      <w:r>
+        <w:rPr>
+          <w:rFonts w:hint="default"/>
+          <w:lang w:val="ru-RU"/>
+        </w:rPr>
+        <w:t>развитые инструменты фильтрации, полнотекстового поиска и рекомендательных систем для подбора резюме;</w:t>
+      </w:r>
+    </w:p>
+    <w:p>
+      <w:pPr>
+        <w:keepNext w:val="0"/>
+        <w:keepLines w:val="0"/>
+        <w:pageBreakBefore w:val="0"/>
+        <w:widowControl/>
+        <w:numPr>
+          <w:ilvl w:val="0"/>
+          <w:numId w:val="4"/>
+        </w:numPr>
+        <w:kinsoku/>
+        <w:wordWrap/>
+        <w:overflowPunct/>
+        <w:topLinePunct w:val="0"/>
+        <w:autoSpaceDE/>
+        <w:autoSpaceDN/>
+        <w:bidi w:val="0"/>
+        <w:adjustRightInd/>
+        <w:snapToGrid/>
+        <w:spacing w:line="228" w:lineRule="auto"/>
+        <w:ind w:left="0" w:leftChars="0" w:firstLine="706" w:firstLineChars="0"/>
+        <w:textAlignment w:val="auto"/>
+        <w:rPr>
+          <w:rFonts w:hint="default"/>
+          <w:lang w:val="ru-RU"/>
+        </w:rPr>
+      </w:pPr>
+      <w:r>
+        <w:rPr>
+          <w:rFonts w:hint="default"/>
+          <w:lang w:val="ru-RU"/>
+        </w:rPr>
+        <w:t>наличие встроенных сервисов открытой аналитики и статистики рынка труда (Индекс rabota.by);</w:t>
+      </w:r>
+    </w:p>
+    <w:p>
+      <w:pPr>
+        <w:keepNext w:val="0"/>
+        <w:keepLines w:val="0"/>
+        <w:pageBreakBefore w:val="0"/>
+        <w:widowControl/>
+        <w:numPr>
+          <w:ilvl w:val="0"/>
+          <w:numId w:val="4"/>
+        </w:numPr>
+        <w:kinsoku/>
+        <w:wordWrap/>
+        <w:overflowPunct/>
+        <w:topLinePunct w:val="0"/>
+        <w:autoSpaceDE/>
+        <w:autoSpaceDN/>
+        <w:bidi w:val="0"/>
+        <w:adjustRightInd/>
+        <w:snapToGrid/>
+        <w:spacing w:line="228" w:lineRule="auto"/>
+        <w:ind w:left="0" w:leftChars="0" w:firstLine="706" w:firstLineChars="0"/>
+        <w:textAlignment w:val="auto"/>
+        <w:rPr>
+          <w:rFonts w:hint="default"/>
+          <w:lang w:val="ru-RU"/>
+        </w:rPr>
+      </w:pPr>
+      <w:r>
+        <w:rPr>
+          <w:rFonts w:hint="default"/>
+          <w:lang w:val="ru-RU"/>
+        </w:rPr>
+        <w:t>валидация профилей работодателей и модерация публикуемого контента.</w:t>
+      </w:r>
+    </w:p>
+    <w:p>
+      <w:pPr>
+        <w:keepNext w:val="0"/>
+        <w:keepLines w:val="0"/>
+        <w:pageBreakBefore w:val="0"/>
+        <w:widowControl/>
+        <w:kinsoku/>
+        <w:wordWrap/>
+        <w:overflowPunct/>
+        <w:topLinePunct w:val="0"/>
+        <w:autoSpaceDE/>
+        <w:autoSpaceDN/>
+        <w:bidi w:val="0"/>
+        <w:adjustRightInd/>
+        <w:snapToGrid/>
+        <w:spacing w:line="228" w:lineRule="auto"/>
+        <w:ind w:firstLine="706"/>
+        <w:textAlignment w:val="auto"/>
+        <w:rPr>
+          <w:rFonts w:hint="default"/>
+          <w:lang w:val="ru-RU"/>
+        </w:rPr>
+      </w:pPr>
+      <w:r>
+        <w:rPr>
+          <w:rFonts w:hint="default"/>
+          <w:lang w:val="ru-RU"/>
+        </w:rPr>
+        <w:t>Недостатки rabota.by по сравнению с разрабатываемым решением:</w:t>
+      </w:r>
+    </w:p>
+    <w:p>
+      <w:pPr>
+        <w:keepNext w:val="0"/>
+        <w:keepLines w:val="0"/>
+        <w:pageBreakBefore w:val="0"/>
+        <w:widowControl/>
+        <w:numPr>
+          <w:ilvl w:val="0"/>
+          <w:numId w:val="4"/>
+        </w:numPr>
+        <w:kinsoku/>
+        <w:wordWrap/>
+        <w:overflowPunct/>
+        <w:topLinePunct w:val="0"/>
+        <w:autoSpaceDE/>
+        <w:autoSpaceDN/>
+        <w:bidi w:val="0"/>
+        <w:adjustRightInd/>
+        <w:snapToGrid/>
+        <w:spacing w:line="228" w:lineRule="auto"/>
+        <w:ind w:left="0" w:leftChars="0" w:firstLine="706" w:firstLineChars="0"/>
+        <w:textAlignment w:val="auto"/>
+        <w:rPr>
+          <w:rFonts w:hint="default"/>
+          <w:lang w:val="ru-RU"/>
+        </w:rPr>
+      </w:pPr>
+      <w:r>
+        <w:rPr>
+          <w:rFonts w:hint="default"/>
+          <w:lang w:val="ru-RU"/>
+        </w:rPr>
+        <w:t>Отсутствие глубокого трекинга воронки (ATS): Ресурс предназначен для первичного сбора откликов, но не позволяет детально кастомизировать и автоматизировать внутренние этапы отбора компании (например, создавать уникальные чек-листы, подключать специфические тестовые задания на промежуточных этапах);</w:t>
+      </w:r>
+    </w:p>
+    <w:p>
+      <w:pPr>
+        <w:keepNext w:val="0"/>
+        <w:keepLines w:val="0"/>
+        <w:pageBreakBefore w:val="0"/>
+        <w:widowControl/>
+        <w:numPr>
+          <w:ilvl w:val="0"/>
+          <w:numId w:val="4"/>
+        </w:numPr>
+        <w:kinsoku/>
+        <w:wordWrap/>
+        <w:overflowPunct/>
+        <w:topLinePunct w:val="0"/>
+        <w:autoSpaceDE/>
+        <w:autoSpaceDN/>
+        <w:bidi w:val="0"/>
+        <w:adjustRightInd/>
+        <w:snapToGrid/>
+        <w:spacing w:line="228" w:lineRule="auto"/>
+        <w:ind w:left="0" w:leftChars="0" w:firstLine="706" w:firstLineChars="0"/>
+        <w:textAlignment w:val="auto"/>
+        <w:rPr>
+          <w:rFonts w:hint="default"/>
+          <w:lang w:val="ru-RU"/>
+        </w:rPr>
+      </w:pPr>
+      <w:r>
+        <w:rPr>
+          <w:rFonts w:hint="default"/>
+          <w:lang w:val="ru-RU"/>
+        </w:rPr>
+        <w:t>Ограниченность внутренних коммуникаций: Чат на платформе ориентирован на первичный контакт; полноценное ведение кандидата, фиксация технических заметок команды и хранение истории интервью по конкретным вакансиям требуют перехода на внешнее ПО;</w:t>
+      </w:r>
+    </w:p>
+    <w:p>
+      <w:pPr>
+        <w:keepNext w:val="0"/>
+        <w:keepLines w:val="0"/>
+        <w:pageBreakBefore w:val="0"/>
+        <w:widowControl/>
+        <w:numPr>
+          <w:ilvl w:val="0"/>
+          <w:numId w:val="4"/>
+        </w:numPr>
+        <w:kinsoku/>
+        <w:wordWrap/>
+        <w:overflowPunct/>
+        <w:topLinePunct w:val="0"/>
+        <w:autoSpaceDE/>
+        <w:autoSpaceDN/>
+        <w:bidi w:val="0"/>
+        <w:adjustRightInd/>
+        <w:snapToGrid/>
+        <w:spacing w:line="228" w:lineRule="auto"/>
+        <w:ind w:left="0" w:leftChars="0" w:firstLine="706" w:firstLineChars="0"/>
+        <w:textAlignment w:val="auto"/>
+        <w:rPr>
+          <w:rFonts w:hint="default"/>
+          <w:lang w:val="ru-RU"/>
+        </w:rPr>
+      </w:pPr>
+      <w:r>
+        <w:rPr>
+          <w:rFonts w:hint="default"/>
+          <w:lang w:val="ru-RU"/>
+        </w:rPr>
+        <w:t>Платная основа для бизнеса: Публикация вакансий и доступ к базе контактов соискателей требуют значительных регулярных финансовых затрат, что делает невыгодным использование платформы в качестве единственной корпоративной базы долгосрочного кадрового резерва;</w:t>
+      </w:r>
+    </w:p>
+    <w:p>
+      <w:pPr>
+        <w:keepNext w:val="0"/>
+        <w:keepLines w:val="0"/>
+        <w:pageBreakBefore w:val="0"/>
+        <w:widowControl/>
+        <w:numPr>
+          <w:ilvl w:val="0"/>
+          <w:numId w:val="4"/>
+        </w:numPr>
+        <w:kinsoku/>
+        <w:wordWrap/>
+        <w:overflowPunct/>
+        <w:topLinePunct w:val="0"/>
+        <w:autoSpaceDE/>
+        <w:autoSpaceDN/>
+        <w:bidi w:val="0"/>
+        <w:adjustRightInd/>
+        <w:snapToGrid/>
+        <w:spacing w:line="228" w:lineRule="auto"/>
+        <w:ind w:firstLine="706"/>
+        <w:textAlignment w:val="auto"/>
+      </w:pPr>
+      <w:r>
+        <w:rPr>
+          <w:rFonts w:hint="default"/>
+          <w:lang w:val="ru-RU"/>
+        </w:rPr>
+        <w:t>Публичность процесса: Внутренние заметки, локальные шаблоны этапов отбора рекрутеров и данные об одобренных кандидатах не могут быть изолированы внутри инфраструктуры конкретной компании.</w:t>
+      </w:r>
+    </w:p>
+    <w:p>
+      <w:pPr>
+        <w:keepNext w:val="0"/>
+        <w:keepLines w:val="0"/>
+        <w:pageBreakBefore w:val="0"/>
+        <w:widowControl/>
+        <w:kinsoku/>
+        <w:wordWrap/>
+        <w:overflowPunct/>
+        <w:topLinePunct w:val="0"/>
+        <w:autoSpaceDE/>
+        <w:autoSpaceDN/>
+        <w:bidi w:val="0"/>
+        <w:adjustRightInd/>
+        <w:snapToGrid/>
+        <w:spacing w:line="228" w:lineRule="auto"/>
+        <w:ind w:firstLine="706"/>
+        <w:textAlignment w:val="auto"/>
+      </w:pPr>
+      <w:r>
+        <w:t>В итоге, несмотря на лидирующие позиции rabota.by в качестве внешней площадки для агрегации трафика вакансий, ресурс полностью лиш</w:t>
+      </w:r>
+      <w:r>
+        <w:rPr>
+          <w:lang w:val="ru-RU"/>
+        </w:rPr>
+        <w:t>ё</w:t>
+      </w:r>
+      <w:r>
+        <w:t>н инструментов для глубокого ведения соискателя внутри корпоративного контура организации. Коммерческая направленность и публичность данных делают невозможным построение на его базе изолированной, безопасной и бесплатной внутренней системы уч</w:t>
+      </w:r>
+      <w:r>
+        <w:rPr>
+          <w:lang w:val="ru-RU"/>
+        </w:rPr>
+        <w:t>ё</w:t>
+      </w:r>
+      <w:r>
+        <w:t xml:space="preserve">та кадров. Это </w:t>
+      </w:r>
+      <w:r>
+        <w:rPr>
+          <w:lang w:val="ru-RU"/>
+        </w:rPr>
+        <w:t>подчёркивает</w:t>
+      </w:r>
+      <w:r>
+        <w:t xml:space="preserve"> острую необходимость разработки автономного On-Premise</w:t>
+      </w:r>
+      <w:r>
+        <w:rPr>
+          <w:rFonts w:hint="default"/>
+          <w:lang w:val="en-US"/>
+        </w:rPr>
+        <w:t>[6]</w:t>
+      </w:r>
+      <w:r>
+        <w:t xml:space="preserve"> веб-приложения «HireVich», совмещающего функции базы данных, интерактивного трекера воронки найма и защищ</w:t>
+      </w:r>
+      <w:r>
+        <w:rPr>
+          <w:lang w:val="ru-RU"/>
+        </w:rPr>
+        <w:t>ё</w:t>
+      </w:r>
+      <w:r>
+        <w:t>нной среды для real-time коммуникации.</w:t>
+      </w:r>
+    </w:p>
+    <w:p>
+      <w:pPr>
+        <w:pStyle w:val="3"/>
         <w:bidi w:val="0"/>
         <w:rPr/>
       </w:pPr>
       <w:r>
-        <w:t>Пользователи системы проходят процедуру регистрации и аутентификации с последующим разграничением прав доступа на основе ролевой модели (Администратор, Рекрутер, Кандидат). Соискатели имеют возможность осуществлять поиск, фильтрацию и сохранение вакансий, редактировать персональный профиль, подавать отклики на интересующие позиции и прозрачно отслеживать статус своей заявки по этапам воронки отбора.</w:t>
-      </w:r>
+        <w:t>1.3 Выводы по разделу</w:t>
+      </w:r>
+    </w:p>
+    <w:p>
+      <w:pPr>
+        <w:pStyle w:val="15"/>
+        <w:keepNext w:val="0"/>
+        <w:keepLines w:val="0"/>
+        <w:pageBreakBefore w:val="0"/>
+        <w:widowControl/>
+        <w:numPr>
+          <w:numId w:val="0"/>
+        </w:numPr>
+        <w:kinsoku/>
+        <w:wordWrap/>
+        <w:overflowPunct/>
+        <w:topLinePunct w:val="0"/>
+        <w:autoSpaceDE/>
+        <w:autoSpaceDN/>
+        <w:bidi w:val="0"/>
+        <w:adjustRightInd/>
+        <w:snapToGrid/>
+        <w:spacing w:line="228" w:lineRule="auto"/>
+        <w:ind w:leftChars="0" w:firstLine="706" w:firstLineChars="0"/>
+        <w:textAlignment w:val="auto"/>
+        <w:rPr/>
+      </w:pPr>
+      <w:r>
+        <w:t>Основной задачей разработки веб-приложения «HireVich» является создание централизованной экосистемы с поддержкой ролей «Администратор», «Рекрутер» и «Кандидат», обеспечивающей автоматизацию полного цикла подбора персонала: от публикации вакансии и настройки индивидуального чек-листа этапов до планирования интервью, ведения чатов в реальном времени и фиксации результатов в реестре одобренных кадров.</w:t>
+      </w:r>
+    </w:p>
+    <w:p>
+      <w:pPr>
+        <w:pStyle w:val="15"/>
+        <w:keepNext w:val="0"/>
+        <w:keepLines w:val="0"/>
+        <w:pageBreakBefore w:val="0"/>
+        <w:widowControl/>
+        <w:numPr>
+          <w:numId w:val="0"/>
+        </w:numPr>
+        <w:kinsoku/>
+        <w:wordWrap/>
+        <w:overflowPunct/>
+        <w:topLinePunct w:val="0"/>
+        <w:autoSpaceDE/>
+        <w:autoSpaceDN/>
+        <w:bidi w:val="0"/>
+        <w:adjustRightInd/>
+        <w:snapToGrid/>
+        <w:spacing w:line="228" w:lineRule="auto"/>
+        <w:ind w:leftChars="0" w:firstLine="706" w:firstLineChars="0"/>
+        <w:textAlignment w:val="auto"/>
+        <w:rPr/>
+      </w:pPr>
+      <w:r>
+        <w:t xml:space="preserve">Анализ существующих аналогичных решений позволил классифицировать их на две группы: специализированные ATS-системы (Huntflow, TalentTech </w:t>
+      </w:r>
+      <w:r>
+        <w:rPr>
+          <w:lang w:val="ru-RU"/>
+        </w:rPr>
+        <w:t>Консалтинг</w:t>
+      </w:r>
+      <w:r>
+        <w:t>) и массовые джоб-борды (rabota.by). Выявлено, что массовые платформы агрегации вакансий отлично справляются с задачей первичного привлечения кандидатов, но непригодны для ведения сложного, конфиденциального и многоэтапного процесса внутреннего отбора. Корпоративные ATS-системы, в свою очередь, оптимизируют работу HR-команды, но изолируют соискателя от процесса, вынуждая вести общение через разрозненные внешние каналы (Email, сторонние мессенджеры).</w:t>
+      </w:r>
+    </w:p>
+    <w:p>
+      <w:pPr>
+        <w:pStyle w:val="15"/>
+        <w:keepNext w:val="0"/>
+        <w:keepLines w:val="0"/>
+        <w:pageBreakBefore w:val="0"/>
+        <w:widowControl/>
+        <w:numPr>
+          <w:numId w:val="0"/>
+        </w:numPr>
+        <w:kinsoku/>
+        <w:wordWrap/>
+        <w:overflowPunct/>
+        <w:topLinePunct w:val="0"/>
+        <w:autoSpaceDE/>
+        <w:autoSpaceDN/>
+        <w:bidi w:val="0"/>
+        <w:adjustRightInd/>
+        <w:snapToGrid/>
+        <w:spacing w:line="228" w:lineRule="auto"/>
+        <w:ind w:leftChars="0" w:firstLine="706" w:firstLineChars="0"/>
+        <w:textAlignment w:val="auto"/>
+      </w:pPr>
+      <w:r>
+        <w:t>Проектируемое веб-приложение «HireVich» призвано занять нишу локальной (On-Premise) экосистемы найма, объединяющей лучшие практики изученных аналогов. Оно предоставляет кандидату прозрачный личный кабинет для отслеживания его прогресса по чек-листу (в отличие от коммерческих ATS), обеспечивает рекрутеру гибкие инструменты ведения воронки и чат «в одном окне» на базе Socket.io (в отличие от rabota.by), а также гарантирует полную независимость от стоимости внешних подписок и безопасность хранения данных за счет развертывания на собственном сервере с СУБД MS SQL Server и брокером RabbitMQ.</w:t>
+      </w:r>
+    </w:p>
+    <w:p>
+      <w:r>
+        <w:br w:type="page"/>
+      </w:r>
+    </w:p>
+    <w:p>
+      <w:pPr>
+        <w:pStyle w:val="2"/>
+        <w:spacing w:before="240"/>
+      </w:pPr>
+      <w:bookmarkStart w:id="6" w:name="_Toc229527911"/>
+      <w:r>
+        <w:t xml:space="preserve">2 Проектирование </w:t>
+      </w:r>
+      <w:r>
+        <w:rPr>
+          <w:lang w:val="en-US"/>
+        </w:rPr>
+        <w:t>web</w:t>
+      </w:r>
+      <w:r>
+        <w:t>-приложения</w:t>
+      </w:r>
+      <w:bookmarkEnd w:id="6"/>
+    </w:p>
+    <w:p>
+      <w:pPr>
+        <w:pStyle w:val="3"/>
+        <w:spacing w:before="120" w:after="240"/>
+        <w:rPr>
+          <w:rFonts w:eastAsiaTheme="minorHAnsi"/>
+          <w:i/>
+          <w:iCs/>
+        </w:rPr>
+      </w:pPr>
+      <w:bookmarkStart w:id="7" w:name="_Toc229527912"/>
+      <w:r>
+        <w:rPr>
+          <w:rFonts w:eastAsiaTheme="minorHAnsi"/>
+          <w:lang w:val="be-BY"/>
+        </w:rPr>
+        <w:t>2</w:t>
+      </w:r>
+      <w:r>
+        <w:rPr>
+          <w:rFonts w:eastAsiaTheme="minorHAnsi"/>
+        </w:rPr>
+        <w:t xml:space="preserve">.1 Архитектура </w:t>
+      </w:r>
+      <w:r>
+        <w:rPr>
+          <w:rFonts w:eastAsiaTheme="minorHAnsi"/>
+          <w:lang w:val="en-US"/>
+        </w:rPr>
+        <w:t>web</w:t>
+      </w:r>
+      <w:r>
+        <w:rPr>
+          <w:rFonts w:eastAsiaTheme="minorHAnsi"/>
+        </w:rPr>
+        <w:t>-приложения</w:t>
+      </w:r>
+      <w:bookmarkEnd w:id="7"/>
     </w:p>
     <w:p>
       <w:pPr>
@@ -1635,25 +3512,7 @@
         <w:rPr/>
       </w:pPr>
       <w:r>
-        <w:t>Рекрутер осуществляет управление жизненным циклом вакансий (публикация, редактирование, закрытие), формирует динамические чек-листы этапов отбора для каждой позиции (на баз</w:t>
-      </w:r>
-      <w:r>
-        <w:rPr>
-          <w:lang w:val="ru-RU"/>
-        </w:rPr>
-        <w:t>е</w:t>
-      </w:r>
-      <w:r>
-        <w:rPr>
-          <w:rFonts w:hint="default"/>
-          <w:lang w:val="ru-RU"/>
-        </w:rPr>
-        <w:t xml:space="preserve"> </w:t>
-      </w:r>
-      <w:bookmarkStart w:id="4" w:name="_GoBack"/>
-      <w:bookmarkEnd w:id="4"/>
-      <w:r>
-        <w:t>шаблонов), ведет учет кандидатов в реестре одобренных, планирует видеоинтервью с генерацией ссылок на встречи и фиксирует служебные заметки о профессиональных навыках соискателя.</w:t>
+        <w:t>Проектирование архитектуры современного веб-приложения для автоматизации рекрутинга требует детальной проработки ролевой модели и разграничения прав доступа к информационным ресурсам системы. Централизованная структура платформы «HireVich» призвана объединить сквозные бизнес-процессы найма, предоставив каждому участнику изолированное и функционально полное рабочее пространство.</w:t>
       </w:r>
     </w:p>
     <w:p>
@@ -1662,12 +3521,1699 @@
         <w:rPr/>
       </w:pPr>
       <w:r>
-        <w:t>Коммуникационный контур платформы обеспечивает двусторонний обмен сообщениями в реальном времени через специализированные чаты, привязанные к конкретным заявкам (откликам). Реализация системы призвана минимизировать рутинную нагрузку на HR-специалистов, стандартизировать воронку найма, исключить потерю кандидатов на промежуточных этапах и повысить общую оперативность подбора кадров.</w:t>
-      </w:r>
-    </w:p>
+        <w:t>В рамках разрабатываемой системы поддерживаются три основные роли пользователей: «Администратор», «Рекрутер» и «Кандидат» (соискатель). Кроме того, предусмотрено состояние «Гость» для неавторизованных посетителей платформы. Каждая из указанных ролей наделена строго определенным набором полномочий и опций, координирующих логику их взаимодействия. Диаграмма вариантов использования (Use Case Diagram), отражающая базовые сценарии и взаимосвязи акт</w:t>
+      </w:r>
+      <w:r>
+        <w:rPr>
+          <w:lang w:val="ru-RU"/>
+        </w:rPr>
+        <w:t>ё</w:t>
+      </w:r>
+      <w:r>
+        <w:t>ров с функциональными блоками приложения, подробно представлена в Приложении А.</w:t>
+      </w:r>
+    </w:p>
+    <w:p>
+      <w:pPr>
+        <w:bidi w:val="0"/>
+        <w:rPr/>
+      </w:pPr>
+      <w:r>
+        <w:t>Для верхнеуровневого понимания структуры прав доступа и распределения зон ответственности в таблице 2.1 приведено обобщ</w:t>
+      </w:r>
+      <w:r>
+        <w:rPr>
+          <w:lang w:val="ru-RU"/>
+        </w:rPr>
+        <w:t>ё</w:t>
+      </w:r>
+      <w:r>
+        <w:t>нное описание назначения каждой роли в архитектуре веб-приложения.</w:t>
+      </w:r>
+    </w:p>
+    <w:p>
+      <w:pPr>
+        <w:keepNext w:val="0"/>
+        <w:keepLines w:val="0"/>
+        <w:pageBreakBefore w:val="0"/>
+        <w:widowControl/>
+        <w:kinsoku/>
+        <w:wordWrap/>
+        <w:overflowPunct/>
+        <w:topLinePunct w:val="0"/>
+        <w:autoSpaceDE/>
+        <w:autoSpaceDN/>
+        <w:bidi w:val="0"/>
+        <w:adjustRightInd/>
+        <w:snapToGrid/>
+        <w:spacing w:before="280"/>
+        <w:ind w:firstLine="0"/>
+        <w:textAlignment w:val="auto"/>
+      </w:pPr>
+      <w:r>
+        <w:t>Таблица 2.1 – Роли пользователей приложения.</w:t>
+      </w:r>
+    </w:p>
+    <w:tbl>
+      <w:tblPr>
+        <w:tblStyle w:val="13"/>
+        <w:tblW w:w="0" w:type="auto"/>
+        <w:jc w:val="center"/>
+        <w:tblBorders>
+          <w:top w:val="single" w:color="auto" w:sz="4" w:space="0"/>
+          <w:left w:val="single" w:color="auto" w:sz="4" w:space="0"/>
+          <w:bottom w:val="single" w:color="auto" w:sz="4" w:space="0"/>
+          <w:right w:val="single" w:color="auto" w:sz="4" w:space="0"/>
+          <w:insideH w:val="single" w:color="auto" w:sz="4" w:space="0"/>
+          <w:insideV w:val="single" w:color="auto" w:sz="4" w:space="0"/>
+        </w:tblBorders>
+        <w:tblLayout w:type="autofit"/>
+        <w:tblCellMar>
+          <w:top w:w="0" w:type="dxa"/>
+          <w:left w:w="108" w:type="dxa"/>
+          <w:bottom w:w="0" w:type="dxa"/>
+          <w:right w:w="108" w:type="dxa"/>
+        </w:tblCellMar>
+      </w:tblPr>
+      <w:tblGrid>
+        <w:gridCol w:w="2101"/>
+        <w:gridCol w:w="7470"/>
+      </w:tblGrid>
+      <w:tr>
+        <w:tblPrEx>
+          <w:tblBorders>
+            <w:top w:val="single" w:color="auto" w:sz="4" w:space="0"/>
+            <w:left w:val="single" w:color="auto" w:sz="4" w:space="0"/>
+            <w:bottom w:val="single" w:color="auto" w:sz="4" w:space="0"/>
+            <w:right w:val="single" w:color="auto" w:sz="4" w:space="0"/>
+            <w:insideH w:val="single" w:color="auto" w:sz="4" w:space="0"/>
+            <w:insideV w:val="single" w:color="auto" w:sz="4" w:space="0"/>
+          </w:tblBorders>
+          <w:tblCellMar>
+            <w:top w:w="0" w:type="dxa"/>
+            <w:left w:w="108" w:type="dxa"/>
+            <w:bottom w:w="0" w:type="dxa"/>
+            <w:right w:w="108" w:type="dxa"/>
+          </w:tblCellMar>
+        </w:tblPrEx>
+        <w:trPr>
+          <w:jc w:val="center"/>
+        </w:trPr>
+        <w:tc>
+          <w:tcPr>
+            <w:tcW w:w="2101" w:type="dxa"/>
+          </w:tcPr>
+          <w:p>
+            <w:pPr>
+              <w:pStyle w:val="18"/>
+              <w:framePr w:wrap="around"/>
+              <w:jc w:val="center"/>
+            </w:pPr>
+            <w:r>
+              <w:t>Роль</w:t>
+            </w:r>
+          </w:p>
+        </w:tc>
+        <w:tc>
+          <w:tcPr>
+            <w:tcW w:w="7470" w:type="dxa"/>
+          </w:tcPr>
+          <w:p>
+            <w:pPr>
+              <w:pStyle w:val="18"/>
+              <w:framePr w:wrap="around"/>
+              <w:jc w:val="center"/>
+            </w:pPr>
+            <w:r>
+              <w:t>Описание роли</w:t>
+            </w:r>
+          </w:p>
+        </w:tc>
+      </w:tr>
+      <w:tr>
+        <w:tblPrEx>
+          <w:tblBorders>
+            <w:top w:val="single" w:color="auto" w:sz="4" w:space="0"/>
+            <w:left w:val="single" w:color="auto" w:sz="4" w:space="0"/>
+            <w:bottom w:val="single" w:color="auto" w:sz="4" w:space="0"/>
+            <w:right w:val="single" w:color="auto" w:sz="4" w:space="0"/>
+            <w:insideH w:val="single" w:color="auto" w:sz="4" w:space="0"/>
+            <w:insideV w:val="single" w:color="auto" w:sz="4" w:space="0"/>
+          </w:tblBorders>
+          <w:tblCellMar>
+            <w:top w:w="0" w:type="dxa"/>
+            <w:left w:w="108" w:type="dxa"/>
+            <w:bottom w:w="0" w:type="dxa"/>
+            <w:right w:w="108" w:type="dxa"/>
+          </w:tblCellMar>
+        </w:tblPrEx>
+        <w:trPr>
+          <w:jc w:val="center"/>
+        </w:trPr>
+        <w:tc>
+          <w:tcPr>
+            <w:tcW w:w="2101" w:type="dxa"/>
+            <w:vAlign w:val="center"/>
+          </w:tcPr>
+          <w:p>
+            <w:pPr>
+              <w:pStyle w:val="18"/>
+              <w:framePr w:wrap="around"/>
+            </w:pPr>
+            <w:r>
+              <w:t>Гость</w:t>
+            </w:r>
+          </w:p>
+        </w:tc>
+        <w:tc>
+          <w:tcPr>
+            <w:tcW w:w="7470" w:type="dxa"/>
+          </w:tcPr>
+          <w:p>
+            <w:pPr>
+              <w:framePr w:wrap="around" w:vAnchor="margin" w:hAnchor="text" w:y="1"/>
+              <w:ind w:firstLine="0"/>
+            </w:pPr>
+            <w:r>
+              <w:t xml:space="preserve">Неавторизованный пользователь системы. Обладает правами на просмотр </w:t>
+            </w:r>
+            <w:r>
+              <w:rPr>
+                <w:lang w:val="ru-RU"/>
+              </w:rPr>
+              <w:t>активных</w:t>
+            </w:r>
+            <w:r>
+              <w:rPr>
+                <w:rFonts w:hint="default"/>
+                <w:lang w:val="ru-RU"/>
+              </w:rPr>
+              <w:t xml:space="preserve"> вакансий</w:t>
+            </w:r>
+            <w:r>
+              <w:t>, ознакомление с общими возможностями платформы, прохождение процедуры регистрации соискателя</w:t>
+            </w:r>
+            <w:r>
+              <w:rPr>
+                <w:rFonts w:hint="default"/>
+                <w:lang w:val="ru-RU"/>
+              </w:rPr>
+              <w:t xml:space="preserve"> или рекрутера</w:t>
+            </w:r>
+            <w:r>
+              <w:t xml:space="preserve"> и авторизации для перехода в статус постоянного пользователя.</w:t>
+            </w:r>
+          </w:p>
+        </w:tc>
+      </w:tr>
+      <w:tr>
+        <w:tblPrEx>
+          <w:tblBorders>
+            <w:top w:val="single" w:color="auto" w:sz="4" w:space="0"/>
+            <w:left w:val="single" w:color="auto" w:sz="4" w:space="0"/>
+            <w:bottom w:val="single" w:color="auto" w:sz="4" w:space="0"/>
+            <w:right w:val="single" w:color="auto" w:sz="4" w:space="0"/>
+            <w:insideH w:val="single" w:color="auto" w:sz="4" w:space="0"/>
+            <w:insideV w:val="single" w:color="auto" w:sz="4" w:space="0"/>
+          </w:tblBorders>
+          <w:tblCellMar>
+            <w:top w:w="0" w:type="dxa"/>
+            <w:left w:w="108" w:type="dxa"/>
+            <w:bottom w:w="0" w:type="dxa"/>
+            <w:right w:w="108" w:type="dxa"/>
+          </w:tblCellMar>
+        </w:tblPrEx>
+        <w:trPr>
+          <w:jc w:val="center"/>
+        </w:trPr>
+        <w:tc>
+          <w:tcPr>
+            <w:tcW w:w="2101" w:type="dxa"/>
+            <w:vAlign w:val="center"/>
+          </w:tcPr>
+          <w:p>
+            <w:pPr>
+              <w:pStyle w:val="18"/>
+              <w:framePr w:wrap="around"/>
+              <w:rPr>
+                <w:rFonts w:hint="default"/>
+                <w:lang w:val="ru-RU"/>
+              </w:rPr>
+            </w:pPr>
+            <w:r>
+              <w:rPr>
+                <w:lang w:val="ru-RU"/>
+              </w:rPr>
+              <w:t>Кандидат</w:t>
+            </w:r>
+          </w:p>
+        </w:tc>
+        <w:tc>
+          <w:tcPr>
+            <w:tcW w:w="7470" w:type="dxa"/>
+          </w:tcPr>
+          <w:p>
+            <w:pPr>
+              <w:pStyle w:val="18"/>
+              <w:framePr w:wrap="around"/>
+            </w:pPr>
+            <w:r>
+              <w:t>Авторизованный соискатель, нацеленный на поиск работы и отслеживание карьерных предложений. Имеет доступ к каталогу активных вакансий, механизмам фильтрации, созданию персонального резюме, подаче откликов, встроенному чату реального времени и интерактивному чек-листу для мониторинга личного прогресса по этапам отбора.</w:t>
+            </w:r>
+          </w:p>
+        </w:tc>
+      </w:tr>
+      <w:tr>
+        <w:tblPrEx>
+          <w:tblBorders>
+            <w:top w:val="single" w:color="auto" w:sz="4" w:space="0"/>
+            <w:left w:val="single" w:color="auto" w:sz="4" w:space="0"/>
+            <w:bottom w:val="single" w:color="auto" w:sz="4" w:space="0"/>
+            <w:right w:val="single" w:color="auto" w:sz="4" w:space="0"/>
+            <w:insideH w:val="single" w:color="auto" w:sz="4" w:space="0"/>
+            <w:insideV w:val="single" w:color="auto" w:sz="4" w:space="0"/>
+          </w:tblBorders>
+          <w:tblCellMar>
+            <w:top w:w="0" w:type="dxa"/>
+            <w:left w:w="108" w:type="dxa"/>
+            <w:bottom w:w="0" w:type="dxa"/>
+            <w:right w:w="108" w:type="dxa"/>
+          </w:tblCellMar>
+        </w:tblPrEx>
+        <w:trPr>
+          <w:jc w:val="center"/>
+        </w:trPr>
+        <w:tc>
+          <w:tcPr>
+            <w:tcW w:w="2101" w:type="dxa"/>
+            <w:vAlign w:val="center"/>
+          </w:tcPr>
+          <w:p>
+            <w:pPr>
+              <w:pStyle w:val="18"/>
+              <w:framePr w:wrap="around"/>
+              <w:rPr>
+                <w:rFonts w:hint="default"/>
+                <w:lang w:val="ru-RU"/>
+              </w:rPr>
+            </w:pPr>
+            <w:r>
+              <w:rPr>
+                <w:lang w:val="ru-RU"/>
+              </w:rPr>
+              <w:t>Рекрутер</w:t>
+            </w:r>
+          </w:p>
+        </w:tc>
+        <w:tc>
+          <w:tcPr>
+            <w:tcW w:w="7470" w:type="dxa"/>
+          </w:tcPr>
+          <w:p>
+            <w:pPr>
+              <w:pStyle w:val="18"/>
+              <w:framePr w:wrap="around"/>
+            </w:pPr>
+            <w:r>
+              <w:t>Авторизованный специалист по подбору персонала. Управляет жизненным циклом вакансий компании, конструирует шаблоны этапов найма, формирует реестр одобренных кандидатов, инициирует сессии интервью, фиксирует служебные заметки по результатам технических собеседований и ведет переписку в чатах заявок.</w:t>
+            </w:r>
+          </w:p>
+        </w:tc>
+      </w:tr>
+    </w:tbl>
+    <w:p/>
+    <w:p/>
+    <w:p>
+      <w:pPr>
+        <w:spacing w:before="280"/>
+        <w:ind w:firstLine="0"/>
+        <w:rPr>
+          <w:rFonts w:hint="default"/>
+          <w:lang w:val="ru-RU"/>
+        </w:rPr>
+      </w:pPr>
+      <w:r>
+        <w:t>Продолжение таблицы 2.</w:t>
+      </w:r>
+      <w:r>
+        <w:rPr>
+          <w:rFonts w:hint="default"/>
+          <w:lang w:val="ru-RU"/>
+        </w:rPr>
+        <w:t>1</w:t>
+      </w:r>
+    </w:p>
+    <w:tbl>
+      <w:tblPr>
+        <w:tblStyle w:val="13"/>
+        <w:tblW w:w="0" w:type="auto"/>
+        <w:jc w:val="center"/>
+        <w:tblBorders>
+          <w:top w:val="single" w:color="auto" w:sz="4" w:space="0"/>
+          <w:left w:val="single" w:color="auto" w:sz="4" w:space="0"/>
+          <w:bottom w:val="single" w:color="auto" w:sz="4" w:space="0"/>
+          <w:right w:val="single" w:color="auto" w:sz="4" w:space="0"/>
+          <w:insideH w:val="single" w:color="auto" w:sz="4" w:space="0"/>
+          <w:insideV w:val="single" w:color="auto" w:sz="4" w:space="0"/>
+        </w:tblBorders>
+        <w:tblLayout w:type="autofit"/>
+        <w:tblCellMar>
+          <w:top w:w="0" w:type="dxa"/>
+          <w:left w:w="108" w:type="dxa"/>
+          <w:bottom w:w="0" w:type="dxa"/>
+          <w:right w:w="108" w:type="dxa"/>
+        </w:tblCellMar>
+      </w:tblPr>
+      <w:tblGrid>
+        <w:gridCol w:w="2101"/>
+        <w:gridCol w:w="7470"/>
+      </w:tblGrid>
+      <w:tr>
+        <w:tblPrEx>
+          <w:tblBorders>
+            <w:top w:val="single" w:color="auto" w:sz="4" w:space="0"/>
+            <w:left w:val="single" w:color="auto" w:sz="4" w:space="0"/>
+            <w:bottom w:val="single" w:color="auto" w:sz="4" w:space="0"/>
+            <w:right w:val="single" w:color="auto" w:sz="4" w:space="0"/>
+            <w:insideH w:val="single" w:color="auto" w:sz="4" w:space="0"/>
+            <w:insideV w:val="single" w:color="auto" w:sz="4" w:space="0"/>
+          </w:tblBorders>
+          <w:tblCellMar>
+            <w:top w:w="0" w:type="dxa"/>
+            <w:left w:w="108" w:type="dxa"/>
+            <w:bottom w:w="0" w:type="dxa"/>
+            <w:right w:w="108" w:type="dxa"/>
+          </w:tblCellMar>
+        </w:tblPrEx>
+        <w:trPr>
+          <w:jc w:val="center"/>
+        </w:trPr>
+        <w:tc>
+          <w:tcPr>
+            <w:tcW w:w="2101" w:type="dxa"/>
+          </w:tcPr>
+          <w:p>
+            <w:pPr>
+              <w:pStyle w:val="18"/>
+              <w:jc w:val="center"/>
+            </w:pPr>
+            <w:r>
+              <w:t>Роль</w:t>
+            </w:r>
+          </w:p>
+        </w:tc>
+        <w:tc>
+          <w:tcPr>
+            <w:tcW w:w="7470" w:type="dxa"/>
+          </w:tcPr>
+          <w:p>
+            <w:pPr>
+              <w:pStyle w:val="18"/>
+              <w:jc w:val="center"/>
+            </w:pPr>
+            <w:r>
+              <w:t>Описание роли</w:t>
+            </w:r>
+          </w:p>
+        </w:tc>
+      </w:tr>
+      <w:tr>
+        <w:tblPrEx>
+          <w:tblBorders>
+            <w:top w:val="single" w:color="auto" w:sz="4" w:space="0"/>
+            <w:left w:val="single" w:color="auto" w:sz="4" w:space="0"/>
+            <w:bottom w:val="single" w:color="auto" w:sz="4" w:space="0"/>
+            <w:right w:val="single" w:color="auto" w:sz="4" w:space="0"/>
+            <w:insideH w:val="single" w:color="auto" w:sz="4" w:space="0"/>
+            <w:insideV w:val="single" w:color="auto" w:sz="4" w:space="0"/>
+          </w:tblBorders>
+          <w:tblCellMar>
+            <w:top w:w="0" w:type="dxa"/>
+            <w:left w:w="108" w:type="dxa"/>
+            <w:bottom w:w="0" w:type="dxa"/>
+            <w:right w:w="108" w:type="dxa"/>
+          </w:tblCellMar>
+        </w:tblPrEx>
+        <w:trPr>
+          <w:jc w:val="center"/>
+        </w:trPr>
+        <w:tc>
+          <w:tcPr>
+            <w:tcW w:w="2101" w:type="dxa"/>
+            <w:vAlign w:val="center"/>
+          </w:tcPr>
+          <w:p>
+            <w:pPr>
+              <w:pStyle w:val="18"/>
+              <w:framePr w:wrap="around"/>
+              <w:rPr>
+                <w:lang w:val="ru-RU"/>
+              </w:rPr>
+            </w:pPr>
+            <w:r>
+              <w:rPr>
+                <w:lang w:val="ru-RU"/>
+              </w:rPr>
+              <w:t>Администратор</w:t>
+            </w:r>
+          </w:p>
+        </w:tc>
+        <w:tc>
+          <w:tcPr>
+            <w:tcW w:w="7470" w:type="dxa"/>
+          </w:tcPr>
+          <w:p>
+            <w:pPr>
+              <w:pStyle w:val="18"/>
+              <w:framePr w:wrap="around"/>
+              <w:rPr>
+                <w:rFonts w:hint="default"/>
+                <w:lang w:val="ru-RU"/>
+              </w:rPr>
+            </w:pPr>
+            <w:r>
+              <w:t>Пользователь с максимальным уровнем привилегий. Отвечает за глобальный мониторинг работоспособности платформы, аудит уч</w:t>
+            </w:r>
+            <w:r>
+              <w:rPr>
+                <w:lang w:val="ru-RU"/>
+              </w:rPr>
+              <w:t>ё</w:t>
+            </w:r>
+            <w:r>
+              <w:t xml:space="preserve">тных записей, выполнение модерационных действий (блокировка/разблокировка нарушителей), </w:t>
+            </w:r>
+            <w:r>
+              <w:rPr>
+                <w:lang w:val="ru-RU"/>
+              </w:rPr>
+              <w:t>а</w:t>
+            </w:r>
+            <w:r>
+              <w:rPr>
+                <w:rFonts w:hint="default"/>
+                <w:lang w:val="ru-RU"/>
+              </w:rPr>
+              <w:t xml:space="preserve"> также модерация вакансий и откликов кандидатов</w:t>
+            </w:r>
+          </w:p>
+        </w:tc>
+      </w:tr>
+    </w:tbl>
     <w:p>
       <w:pPr>
         <w:ind w:left="0" w:leftChars="0" w:firstLine="0" w:firstLineChars="0"/>
+      </w:pPr>
+    </w:p>
+    <w:p>
+      <w:pPr>
+        <w:bidi w:val="0"/>
+      </w:pPr>
+      <w:r>
+        <w:t>Детальное проектирование информационной системы подразумевает декомпозицию общих сценариев на атомарные функциональные операции. Данный подход позволяет сформировать точные требования к программным интерфейсам (API) серверной части и компонентам пользовательского интерфейса. Полный перечень функциональных возможностей веб-приложения «HireVich», упорядоченный по логическим блокам и закрепленный за соответствующими ролями, подробно представлен в таблице 2.2.</w:t>
+      </w:r>
+    </w:p>
+    <w:p>
+      <w:pPr>
+        <w:spacing w:before="280"/>
+        <w:ind w:firstLine="0"/>
+      </w:pPr>
+      <w:r>
+        <w:t>Таблица 2.2 – Функциональные возможности приложения</w:t>
+      </w:r>
+    </w:p>
+    <w:tbl>
+      <w:tblPr>
+        <w:tblStyle w:val="13"/>
+        <w:tblW w:w="9432" w:type="dxa"/>
+        <w:tblInd w:w="0" w:type="dxa"/>
+        <w:tblBorders>
+          <w:top w:val="single" w:color="auto" w:sz="4" w:space="0"/>
+          <w:left w:val="single" w:color="auto" w:sz="4" w:space="0"/>
+          <w:bottom w:val="single" w:color="auto" w:sz="4" w:space="0"/>
+          <w:right w:val="single" w:color="auto" w:sz="4" w:space="0"/>
+          <w:insideH w:val="single" w:color="auto" w:sz="4" w:space="0"/>
+          <w:insideV w:val="single" w:color="auto" w:sz="4" w:space="0"/>
+        </w:tblBorders>
+        <w:tblLayout w:type="fixed"/>
+        <w:tblCellMar>
+          <w:top w:w="0" w:type="dxa"/>
+          <w:left w:w="108" w:type="dxa"/>
+          <w:bottom w:w="0" w:type="dxa"/>
+          <w:right w:w="108" w:type="dxa"/>
+        </w:tblCellMar>
+      </w:tblPr>
+      <w:tblGrid>
+        <w:gridCol w:w="488"/>
+        <w:gridCol w:w="2630"/>
+        <w:gridCol w:w="2114"/>
+        <w:gridCol w:w="4200"/>
+      </w:tblGrid>
+      <w:tr>
+        <w:tblPrEx>
+          <w:tblBorders>
+            <w:top w:val="single" w:color="auto" w:sz="4" w:space="0"/>
+            <w:left w:val="single" w:color="auto" w:sz="4" w:space="0"/>
+            <w:bottom w:val="single" w:color="auto" w:sz="4" w:space="0"/>
+            <w:right w:val="single" w:color="auto" w:sz="4" w:space="0"/>
+            <w:insideH w:val="single" w:color="auto" w:sz="4" w:space="0"/>
+            <w:insideV w:val="single" w:color="auto" w:sz="4" w:space="0"/>
+          </w:tblBorders>
+          <w:tblCellMar>
+            <w:top w:w="0" w:type="dxa"/>
+            <w:left w:w="108" w:type="dxa"/>
+            <w:bottom w:w="0" w:type="dxa"/>
+            <w:right w:w="108" w:type="dxa"/>
+          </w:tblCellMar>
+        </w:tblPrEx>
+        <w:trPr>
+          <w:trHeight w:val="289" w:hRule="atLeast"/>
+        </w:trPr>
+        <w:tc>
+          <w:tcPr>
+            <w:tcW w:w="488" w:type="dxa"/>
+            <w:vAlign w:val="center"/>
+          </w:tcPr>
+          <w:p>
+            <w:pPr>
+              <w:pStyle w:val="18"/>
+              <w:framePr w:hSpace="0" w:wrap="auto" w:vAnchor="margin" w:hAnchor="text" w:xAlign="left" w:yAlign="inline"/>
+            </w:pPr>
+            <w:r>
+              <w:t>№</w:t>
+            </w:r>
+          </w:p>
+        </w:tc>
+        <w:tc>
+          <w:tcPr>
+            <w:tcW w:w="2630" w:type="dxa"/>
+            <w:vAlign w:val="center"/>
+          </w:tcPr>
+          <w:p>
+            <w:pPr>
+              <w:pStyle w:val="18"/>
+              <w:framePr w:hSpace="0" w:wrap="auto" w:vAnchor="margin" w:hAnchor="text" w:xAlign="left" w:yAlign="inline"/>
+              <w:jc w:val="center"/>
+            </w:pPr>
+            <w:r>
+              <w:t>Операция</w:t>
+            </w:r>
+          </w:p>
+        </w:tc>
+        <w:tc>
+          <w:tcPr>
+            <w:tcW w:w="2114" w:type="dxa"/>
+            <w:vAlign w:val="center"/>
+          </w:tcPr>
+          <w:p>
+            <w:pPr>
+              <w:pStyle w:val="18"/>
+              <w:framePr w:hSpace="0" w:wrap="auto" w:vAnchor="margin" w:hAnchor="text" w:xAlign="left" w:yAlign="inline"/>
+              <w:jc w:val="center"/>
+            </w:pPr>
+            <w:r>
+              <w:t>Роль</w:t>
+            </w:r>
+          </w:p>
+        </w:tc>
+        <w:tc>
+          <w:tcPr>
+            <w:tcW w:w="4200" w:type="dxa"/>
+            <w:vAlign w:val="center"/>
+          </w:tcPr>
+          <w:p>
+            <w:pPr>
+              <w:pStyle w:val="18"/>
+              <w:framePr w:hSpace="0" w:wrap="auto" w:vAnchor="margin" w:hAnchor="text" w:xAlign="left" w:yAlign="inline"/>
+              <w:jc w:val="center"/>
+            </w:pPr>
+            <w:r>
+              <w:t>Описание</w:t>
+            </w:r>
+          </w:p>
+        </w:tc>
+      </w:tr>
+      <w:tr>
+        <w:tblPrEx>
+          <w:tblBorders>
+            <w:top w:val="single" w:color="auto" w:sz="4" w:space="0"/>
+            <w:left w:val="single" w:color="auto" w:sz="4" w:space="0"/>
+            <w:bottom w:val="single" w:color="auto" w:sz="4" w:space="0"/>
+            <w:right w:val="single" w:color="auto" w:sz="4" w:space="0"/>
+            <w:insideH w:val="single" w:color="auto" w:sz="4" w:space="0"/>
+            <w:insideV w:val="single" w:color="auto" w:sz="4" w:space="0"/>
+          </w:tblBorders>
+          <w:tblCellMar>
+            <w:top w:w="0" w:type="dxa"/>
+            <w:left w:w="108" w:type="dxa"/>
+            <w:bottom w:w="0" w:type="dxa"/>
+            <w:right w:w="108" w:type="dxa"/>
+          </w:tblCellMar>
+        </w:tblPrEx>
+        <w:trPr>
+          <w:trHeight w:val="289" w:hRule="atLeast"/>
+        </w:trPr>
+        <w:tc>
+          <w:tcPr>
+            <w:tcW w:w="488" w:type="dxa"/>
+            <w:vAlign w:val="center"/>
+          </w:tcPr>
+          <w:p>
+            <w:pPr>
+              <w:pStyle w:val="18"/>
+              <w:framePr w:hSpace="0" w:wrap="auto" w:vAnchor="margin" w:hAnchor="text" w:xAlign="left" w:yAlign="inline"/>
+              <w:rPr>
+                <w:rFonts w:hint="default"/>
+                <w:lang w:val="ru-RU"/>
+              </w:rPr>
+            </w:pPr>
+            <w:r>
+              <w:rPr>
+                <w:rFonts w:hint="default"/>
+                <w:lang w:val="ru-RU"/>
+              </w:rPr>
+              <w:t>1</w:t>
+            </w:r>
+          </w:p>
+        </w:tc>
+        <w:tc>
+          <w:tcPr>
+            <w:tcW w:w="2630" w:type="dxa"/>
+            <w:vAlign w:val="center"/>
+          </w:tcPr>
+          <w:p>
+            <w:pPr>
+              <w:pStyle w:val="18"/>
+              <w:framePr w:hSpace="0" w:wrap="auto" w:vAnchor="margin" w:hAnchor="text" w:xAlign="left" w:yAlign="inline"/>
+              <w:jc w:val="both"/>
+              <w:rPr>
+                <w:rFonts w:hint="default"/>
+                <w:lang w:val="ru-RU"/>
+              </w:rPr>
+            </w:pPr>
+            <w:r>
+              <w:rPr>
+                <w:lang w:val="ru-RU"/>
+              </w:rPr>
+              <w:t>Регистрация</w:t>
+            </w:r>
+          </w:p>
+        </w:tc>
+        <w:tc>
+          <w:tcPr>
+            <w:tcW w:w="2114" w:type="dxa"/>
+            <w:vAlign w:val="center"/>
+          </w:tcPr>
+          <w:p>
+            <w:pPr>
+              <w:pStyle w:val="18"/>
+              <w:framePr w:hSpace="0" w:wrap="auto" w:vAnchor="margin" w:hAnchor="text" w:xAlign="left" w:yAlign="inline"/>
+              <w:jc w:val="both"/>
+              <w:rPr>
+                <w:rFonts w:hint="default"/>
+                <w:lang w:val="ru-RU"/>
+              </w:rPr>
+            </w:pPr>
+            <w:r>
+              <w:rPr>
+                <w:lang w:val="ru-RU"/>
+              </w:rPr>
+              <w:t>Гость</w:t>
+            </w:r>
+          </w:p>
+        </w:tc>
+        <w:tc>
+          <w:tcPr>
+            <w:tcW w:w="4200" w:type="dxa"/>
+            <w:vAlign w:val="center"/>
+          </w:tcPr>
+          <w:p>
+            <w:pPr>
+              <w:pStyle w:val="18"/>
+              <w:framePr w:hSpace="0" w:wrap="auto" w:vAnchor="margin" w:hAnchor="text" w:xAlign="left" w:yAlign="inline"/>
+              <w:jc w:val="both"/>
+            </w:pPr>
+            <w:r>
+              <w:t>Создание уч</w:t>
+            </w:r>
+            <w:r>
+              <w:rPr>
+                <w:lang w:val="ru-RU"/>
+              </w:rPr>
+              <w:t>ё</w:t>
+            </w:r>
+            <w:r>
+              <w:t xml:space="preserve">тной записи </w:t>
+            </w:r>
+            <w:r>
+              <w:rPr>
+                <w:lang w:val="ru-RU"/>
+              </w:rPr>
+              <w:t>пользователя</w:t>
+            </w:r>
+            <w:r>
+              <w:t>, первичная валидация данных и внесение записи в базу данных.</w:t>
+            </w:r>
+          </w:p>
+        </w:tc>
+      </w:tr>
+      <w:tr>
+        <w:tblPrEx>
+          <w:tblBorders>
+            <w:top w:val="single" w:color="auto" w:sz="4" w:space="0"/>
+            <w:left w:val="single" w:color="auto" w:sz="4" w:space="0"/>
+            <w:bottom w:val="single" w:color="auto" w:sz="4" w:space="0"/>
+            <w:right w:val="single" w:color="auto" w:sz="4" w:space="0"/>
+            <w:insideH w:val="single" w:color="auto" w:sz="4" w:space="0"/>
+            <w:insideV w:val="single" w:color="auto" w:sz="4" w:space="0"/>
+          </w:tblBorders>
+          <w:tblCellMar>
+            <w:top w:w="0" w:type="dxa"/>
+            <w:left w:w="108" w:type="dxa"/>
+            <w:bottom w:w="0" w:type="dxa"/>
+            <w:right w:w="108" w:type="dxa"/>
+          </w:tblCellMar>
+        </w:tblPrEx>
+        <w:trPr>
+          <w:trHeight w:val="289" w:hRule="atLeast"/>
+        </w:trPr>
+        <w:tc>
+          <w:tcPr>
+            <w:tcW w:w="488" w:type="dxa"/>
+            <w:vAlign w:val="center"/>
+          </w:tcPr>
+          <w:p>
+            <w:pPr>
+              <w:pStyle w:val="18"/>
+              <w:framePr w:hSpace="0" w:wrap="auto" w:vAnchor="margin" w:hAnchor="text" w:xAlign="left" w:yAlign="inline"/>
+              <w:rPr>
+                <w:rFonts w:hint="default"/>
+                <w:lang w:val="ru-RU"/>
+              </w:rPr>
+            </w:pPr>
+            <w:r>
+              <w:rPr>
+                <w:rFonts w:hint="default"/>
+                <w:lang w:val="ru-RU"/>
+              </w:rPr>
+              <w:t>2</w:t>
+            </w:r>
+          </w:p>
+        </w:tc>
+        <w:tc>
+          <w:tcPr>
+            <w:tcW w:w="2630" w:type="dxa"/>
+            <w:vAlign w:val="center"/>
+          </w:tcPr>
+          <w:p>
+            <w:pPr>
+              <w:pStyle w:val="18"/>
+              <w:framePr w:hSpace="0" w:wrap="auto" w:vAnchor="margin" w:hAnchor="text" w:xAlign="left" w:yAlign="inline"/>
+              <w:jc w:val="both"/>
+              <w:rPr>
+                <w:lang w:val="ru-RU"/>
+              </w:rPr>
+            </w:pPr>
+            <w:r>
+              <w:rPr>
+                <w:lang w:val="ru-RU"/>
+              </w:rPr>
+              <w:t>Авторизация</w:t>
+            </w:r>
+          </w:p>
+        </w:tc>
+        <w:tc>
+          <w:tcPr>
+            <w:tcW w:w="2114" w:type="dxa"/>
+            <w:vAlign w:val="center"/>
+          </w:tcPr>
+          <w:p>
+            <w:pPr>
+              <w:pStyle w:val="18"/>
+              <w:framePr w:hSpace="0" w:wrap="auto" w:vAnchor="margin" w:hAnchor="text" w:xAlign="left" w:yAlign="inline"/>
+              <w:jc w:val="both"/>
+              <w:rPr>
+                <w:lang w:val="ru-RU"/>
+              </w:rPr>
+            </w:pPr>
+            <w:r>
+              <w:rPr>
+                <w:lang w:val="ru-RU"/>
+              </w:rPr>
+              <w:t>Гость</w:t>
+            </w:r>
+          </w:p>
+        </w:tc>
+        <w:tc>
+          <w:tcPr>
+            <w:tcW w:w="4200" w:type="dxa"/>
+            <w:vAlign w:val="center"/>
+          </w:tcPr>
+          <w:p>
+            <w:pPr>
+              <w:pStyle w:val="18"/>
+              <w:framePr w:hSpace="0" w:wrap="auto" w:vAnchor="margin" w:hAnchor="text" w:xAlign="left" w:yAlign="inline"/>
+              <w:jc w:val="both"/>
+            </w:pPr>
+            <w:r>
+              <w:t>Аутентификация пользователя по email и паролю с выдачей JWT-токена доступа.</w:t>
+            </w:r>
+          </w:p>
+        </w:tc>
+      </w:tr>
+      <w:tr>
+        <w:tblPrEx>
+          <w:tblBorders>
+            <w:top w:val="single" w:color="auto" w:sz="4" w:space="0"/>
+            <w:left w:val="single" w:color="auto" w:sz="4" w:space="0"/>
+            <w:bottom w:val="single" w:color="auto" w:sz="4" w:space="0"/>
+            <w:right w:val="single" w:color="auto" w:sz="4" w:space="0"/>
+            <w:insideH w:val="single" w:color="auto" w:sz="4" w:space="0"/>
+            <w:insideV w:val="single" w:color="auto" w:sz="4" w:space="0"/>
+          </w:tblBorders>
+          <w:tblCellMar>
+            <w:top w:w="0" w:type="dxa"/>
+            <w:left w:w="108" w:type="dxa"/>
+            <w:bottom w:w="0" w:type="dxa"/>
+            <w:right w:w="108" w:type="dxa"/>
+          </w:tblCellMar>
+        </w:tblPrEx>
+        <w:trPr>
+          <w:trHeight w:val="289" w:hRule="atLeast"/>
+        </w:trPr>
+        <w:tc>
+          <w:tcPr>
+            <w:tcW w:w="488" w:type="dxa"/>
+            <w:vAlign w:val="center"/>
+          </w:tcPr>
+          <w:p>
+            <w:pPr>
+              <w:pStyle w:val="18"/>
+              <w:framePr w:hSpace="0" w:wrap="auto" w:vAnchor="margin" w:hAnchor="text" w:xAlign="left" w:yAlign="inline"/>
+              <w:rPr>
+                <w:rFonts w:hint="default"/>
+                <w:lang w:val="ru-RU"/>
+              </w:rPr>
+            </w:pPr>
+            <w:r>
+              <w:rPr>
+                <w:rFonts w:hint="default"/>
+                <w:lang w:val="ru-RU"/>
+              </w:rPr>
+              <w:t>3</w:t>
+            </w:r>
+          </w:p>
+        </w:tc>
+        <w:tc>
+          <w:tcPr>
+            <w:tcW w:w="2630" w:type="dxa"/>
+            <w:vAlign w:val="center"/>
+          </w:tcPr>
+          <w:p>
+            <w:pPr>
+              <w:pStyle w:val="18"/>
+              <w:framePr w:hSpace="0" w:wrap="auto" w:vAnchor="margin" w:hAnchor="text" w:xAlign="left" w:yAlign="inline"/>
+              <w:jc w:val="both"/>
+              <w:rPr>
+                <w:rFonts w:hint="default"/>
+                <w:lang w:val="ru-RU"/>
+              </w:rPr>
+            </w:pPr>
+            <w:r>
+              <w:rPr>
+                <w:lang w:val="ru-RU"/>
+              </w:rPr>
+              <w:t>Просмотр</w:t>
+            </w:r>
+            <w:r>
+              <w:rPr>
+                <w:rFonts w:hint="default"/>
+                <w:lang w:val="ru-RU"/>
+              </w:rPr>
+              <w:t xml:space="preserve"> активных вакансий</w:t>
+            </w:r>
+          </w:p>
+        </w:tc>
+        <w:tc>
+          <w:tcPr>
+            <w:tcW w:w="2114" w:type="dxa"/>
+            <w:vAlign w:val="center"/>
+          </w:tcPr>
+          <w:p>
+            <w:pPr>
+              <w:pStyle w:val="18"/>
+              <w:framePr w:hSpace="0" w:wrap="auto" w:vAnchor="margin" w:hAnchor="text" w:xAlign="left" w:yAlign="inline"/>
+              <w:jc w:val="both"/>
+              <w:rPr>
+                <w:rFonts w:hint="default"/>
+                <w:lang w:val="ru-RU"/>
+              </w:rPr>
+            </w:pPr>
+            <w:r>
+              <w:rPr>
+                <w:lang w:val="ru-RU"/>
+              </w:rPr>
+              <w:t>Все</w:t>
+            </w:r>
+            <w:r>
+              <w:rPr>
+                <w:rFonts w:hint="default"/>
+                <w:lang w:val="ru-RU"/>
+              </w:rPr>
+              <w:t xml:space="preserve"> роли</w:t>
+            </w:r>
+          </w:p>
+        </w:tc>
+        <w:tc>
+          <w:tcPr>
+            <w:tcW w:w="4200" w:type="dxa"/>
+            <w:vAlign w:val="center"/>
+          </w:tcPr>
+          <w:p>
+            <w:pPr>
+              <w:pStyle w:val="18"/>
+              <w:framePr w:hSpace="0" w:wrap="auto" w:vAnchor="margin" w:hAnchor="text" w:xAlign="left" w:yAlign="inline"/>
+              <w:jc w:val="both"/>
+            </w:pPr>
+          </w:p>
+        </w:tc>
+      </w:tr>
+      <w:tr>
+        <w:tblPrEx>
+          <w:tblBorders>
+            <w:top w:val="single" w:color="auto" w:sz="4" w:space="0"/>
+            <w:left w:val="single" w:color="auto" w:sz="4" w:space="0"/>
+            <w:bottom w:val="single" w:color="auto" w:sz="4" w:space="0"/>
+            <w:right w:val="single" w:color="auto" w:sz="4" w:space="0"/>
+            <w:insideH w:val="single" w:color="auto" w:sz="4" w:space="0"/>
+            <w:insideV w:val="single" w:color="auto" w:sz="4" w:space="0"/>
+          </w:tblBorders>
+          <w:tblCellMar>
+            <w:top w:w="0" w:type="dxa"/>
+            <w:left w:w="108" w:type="dxa"/>
+            <w:bottom w:w="0" w:type="dxa"/>
+            <w:right w:w="108" w:type="dxa"/>
+          </w:tblCellMar>
+        </w:tblPrEx>
+        <w:trPr>
+          <w:trHeight w:val="289" w:hRule="atLeast"/>
+        </w:trPr>
+        <w:tc>
+          <w:tcPr>
+            <w:tcW w:w="488" w:type="dxa"/>
+            <w:vAlign w:val="center"/>
+          </w:tcPr>
+          <w:p>
+            <w:pPr>
+              <w:pStyle w:val="18"/>
+              <w:framePr w:hSpace="0" w:wrap="auto" w:vAnchor="margin" w:hAnchor="text" w:xAlign="left" w:yAlign="inline"/>
+              <w:rPr>
+                <w:rFonts w:hint="default"/>
+                <w:lang w:val="ru-RU"/>
+              </w:rPr>
+            </w:pPr>
+            <w:r>
+              <w:rPr>
+                <w:rFonts w:hint="default"/>
+                <w:lang w:val="ru-RU"/>
+              </w:rPr>
+              <w:t>4</w:t>
+            </w:r>
+          </w:p>
+        </w:tc>
+        <w:tc>
+          <w:tcPr>
+            <w:tcW w:w="2630" w:type="dxa"/>
+            <w:vAlign w:val="center"/>
+          </w:tcPr>
+          <w:p>
+            <w:pPr>
+              <w:pStyle w:val="18"/>
+              <w:framePr w:hSpace="0" w:wrap="auto" w:vAnchor="margin" w:hAnchor="text" w:xAlign="left" w:yAlign="inline"/>
+              <w:jc w:val="both"/>
+              <w:rPr>
+                <w:rFonts w:hint="default"/>
+                <w:lang w:val="ru-RU"/>
+              </w:rPr>
+            </w:pPr>
+            <w:r>
+              <w:rPr>
+                <w:rFonts w:hint="default"/>
+                <w:lang w:val="ru-RU"/>
+              </w:rPr>
+              <w:t>Поиск и фильтрация вакансий</w:t>
+            </w:r>
+          </w:p>
+        </w:tc>
+        <w:tc>
+          <w:tcPr>
+            <w:tcW w:w="2114" w:type="dxa"/>
+            <w:vAlign w:val="center"/>
+          </w:tcPr>
+          <w:p>
+            <w:pPr>
+              <w:pStyle w:val="18"/>
+              <w:framePr w:hSpace="0" w:wrap="auto" w:vAnchor="margin" w:hAnchor="text" w:xAlign="left" w:yAlign="inline"/>
+              <w:jc w:val="both"/>
+              <w:rPr>
+                <w:rFonts w:hint="default"/>
+                <w:lang w:val="ru-RU"/>
+              </w:rPr>
+            </w:pPr>
+            <w:r>
+              <w:rPr>
+                <w:lang w:val="ru-RU"/>
+              </w:rPr>
+              <w:t>Все</w:t>
+            </w:r>
+            <w:r>
+              <w:rPr>
+                <w:rFonts w:hint="default"/>
+                <w:lang w:val="ru-RU"/>
+              </w:rPr>
+              <w:t xml:space="preserve"> роли</w:t>
+            </w:r>
+            <w:bookmarkStart w:id="9" w:name="_GoBack"/>
+            <w:bookmarkEnd w:id="9"/>
+          </w:p>
+        </w:tc>
+        <w:tc>
+          <w:tcPr>
+            <w:tcW w:w="4200" w:type="dxa"/>
+            <w:vAlign w:val="center"/>
+          </w:tcPr>
+          <w:p>
+            <w:pPr>
+              <w:pStyle w:val="18"/>
+              <w:framePr w:hSpace="0" w:wrap="auto" w:vAnchor="margin" w:hAnchor="text" w:xAlign="left" w:yAlign="inline"/>
+              <w:jc w:val="both"/>
+            </w:pPr>
+            <w:r>
+              <w:t>Управление персональными данными, контактами и текстовым описанием «о себе» (</w:t>
+            </w:r>
+            <w:r>
+              <w:rPr>
+                <w:rFonts w:hint="default"/>
+                <w:lang w:val="en-US"/>
+              </w:rPr>
+              <w:t>Bio</w:t>
+            </w:r>
+            <w:r>
+              <w:t>) в рамках доступных полей.</w:t>
+            </w:r>
+          </w:p>
+        </w:tc>
+      </w:tr>
+      <w:tr>
+        <w:tblPrEx>
+          <w:tblBorders>
+            <w:top w:val="single" w:color="auto" w:sz="4" w:space="0"/>
+            <w:left w:val="single" w:color="auto" w:sz="4" w:space="0"/>
+            <w:bottom w:val="single" w:color="auto" w:sz="4" w:space="0"/>
+            <w:right w:val="single" w:color="auto" w:sz="4" w:space="0"/>
+            <w:insideH w:val="single" w:color="auto" w:sz="4" w:space="0"/>
+            <w:insideV w:val="single" w:color="auto" w:sz="4" w:space="0"/>
+          </w:tblBorders>
+          <w:tblCellMar>
+            <w:top w:w="0" w:type="dxa"/>
+            <w:left w:w="108" w:type="dxa"/>
+            <w:bottom w:w="0" w:type="dxa"/>
+            <w:right w:w="108" w:type="dxa"/>
+          </w:tblCellMar>
+        </w:tblPrEx>
+        <w:trPr>
+          <w:trHeight w:val="289" w:hRule="atLeast"/>
+        </w:trPr>
+        <w:tc>
+          <w:tcPr>
+            <w:tcW w:w="488" w:type="dxa"/>
+            <w:vAlign w:val="center"/>
+          </w:tcPr>
+          <w:p>
+            <w:pPr>
+              <w:pStyle w:val="18"/>
+              <w:framePr w:hSpace="0" w:wrap="auto" w:vAnchor="margin" w:hAnchor="text" w:xAlign="left" w:yAlign="inline"/>
+              <w:rPr>
+                <w:rFonts w:hint="default"/>
+                <w:lang w:val="en-US"/>
+              </w:rPr>
+            </w:pPr>
+            <w:r>
+              <w:rPr>
+                <w:rFonts w:hint="default"/>
+                <w:lang w:val="en-US"/>
+              </w:rPr>
+              <w:t>5</w:t>
+            </w:r>
+          </w:p>
+        </w:tc>
+        <w:tc>
+          <w:tcPr>
+            <w:tcW w:w="2630" w:type="dxa"/>
+            <w:vAlign w:val="center"/>
+          </w:tcPr>
+          <w:p>
+            <w:pPr>
+              <w:pStyle w:val="18"/>
+              <w:framePr w:hSpace="0" w:wrap="auto" w:vAnchor="margin" w:hAnchor="text" w:xAlign="left" w:yAlign="inline"/>
+              <w:jc w:val="both"/>
+              <w:rPr>
+                <w:rFonts w:hint="default"/>
+                <w:lang w:val="ru-RU"/>
+              </w:rPr>
+            </w:pPr>
+            <w:r>
+              <w:rPr>
+                <w:rFonts w:hint="default"/>
+                <w:lang w:val="ru-RU"/>
+              </w:rPr>
+              <w:t>Просмотр и редактирование профиля</w:t>
+            </w:r>
+          </w:p>
+        </w:tc>
+        <w:tc>
+          <w:tcPr>
+            <w:tcW w:w="2114" w:type="dxa"/>
+            <w:vAlign w:val="center"/>
+          </w:tcPr>
+          <w:p>
+            <w:pPr>
+              <w:pStyle w:val="18"/>
+              <w:framePr w:hSpace="0" w:wrap="auto" w:vAnchor="margin" w:hAnchor="text" w:xAlign="left" w:yAlign="inline"/>
+              <w:jc w:val="both"/>
+              <w:rPr>
+                <w:rFonts w:hint="default"/>
+                <w:lang w:val="ru-RU"/>
+              </w:rPr>
+            </w:pPr>
+            <w:r>
+              <w:rPr>
+                <w:lang w:val="ru-RU"/>
+              </w:rPr>
+              <w:t>Кандидат</w:t>
+            </w:r>
+            <w:r>
+              <w:rPr>
+                <w:rFonts w:hint="default"/>
+                <w:lang w:val="ru-RU"/>
+              </w:rPr>
+              <w:t>, рекрутер, администратор</w:t>
+            </w:r>
+          </w:p>
+        </w:tc>
+        <w:tc>
+          <w:tcPr>
+            <w:tcW w:w="4200" w:type="dxa"/>
+            <w:vAlign w:val="center"/>
+          </w:tcPr>
+          <w:p>
+            <w:pPr>
+              <w:pStyle w:val="18"/>
+              <w:framePr w:hSpace="0" w:wrap="auto" w:vAnchor="margin" w:hAnchor="text" w:xAlign="left" w:yAlign="inline"/>
+              <w:jc w:val="both"/>
+            </w:pPr>
+            <w:r>
+              <w:t>Управление персональными данными, контактами и текстовым описанием «о себе» (</w:t>
+            </w:r>
+            <w:r>
+              <w:rPr>
+                <w:rFonts w:hint="default"/>
+                <w:lang w:val="en-US"/>
+              </w:rPr>
+              <w:t>Bio</w:t>
+            </w:r>
+            <w:r>
+              <w:t>) в рамках доступных полей.</w:t>
+            </w:r>
+          </w:p>
+        </w:tc>
+      </w:tr>
+      <w:tr>
+        <w:tblPrEx>
+          <w:tblBorders>
+            <w:top w:val="single" w:color="auto" w:sz="4" w:space="0"/>
+            <w:left w:val="single" w:color="auto" w:sz="4" w:space="0"/>
+            <w:bottom w:val="single" w:color="auto" w:sz="4" w:space="0"/>
+            <w:right w:val="single" w:color="auto" w:sz="4" w:space="0"/>
+            <w:insideH w:val="single" w:color="auto" w:sz="4" w:space="0"/>
+            <w:insideV w:val="single" w:color="auto" w:sz="4" w:space="0"/>
+          </w:tblBorders>
+          <w:tblCellMar>
+            <w:top w:w="0" w:type="dxa"/>
+            <w:left w:w="108" w:type="dxa"/>
+            <w:bottom w:w="0" w:type="dxa"/>
+            <w:right w:w="108" w:type="dxa"/>
+          </w:tblCellMar>
+        </w:tblPrEx>
+        <w:trPr>
+          <w:trHeight w:val="289" w:hRule="atLeast"/>
+        </w:trPr>
+        <w:tc>
+          <w:tcPr>
+            <w:tcW w:w="488" w:type="dxa"/>
+            <w:vAlign w:val="center"/>
+          </w:tcPr>
+          <w:p>
+            <w:pPr>
+              <w:pStyle w:val="18"/>
+              <w:framePr w:hSpace="0" w:wrap="auto" w:vAnchor="margin" w:hAnchor="text" w:xAlign="left" w:yAlign="inline"/>
+              <w:rPr>
+                <w:rFonts w:hint="default"/>
+                <w:lang w:val="en-US"/>
+              </w:rPr>
+            </w:pPr>
+          </w:p>
+        </w:tc>
+        <w:tc>
+          <w:tcPr>
+            <w:tcW w:w="2630" w:type="dxa"/>
+            <w:vAlign w:val="center"/>
+          </w:tcPr>
+          <w:p>
+            <w:pPr>
+              <w:pStyle w:val="18"/>
+              <w:framePr w:hSpace="0" w:wrap="auto" w:vAnchor="margin" w:hAnchor="text" w:xAlign="left" w:yAlign="inline"/>
+              <w:jc w:val="both"/>
+              <w:rPr>
+                <w:rFonts w:hint="default"/>
+                <w:lang w:val="ru-RU"/>
+              </w:rPr>
+            </w:pPr>
+          </w:p>
+        </w:tc>
+        <w:tc>
+          <w:tcPr>
+            <w:tcW w:w="2114" w:type="dxa"/>
+            <w:vAlign w:val="center"/>
+          </w:tcPr>
+          <w:p>
+            <w:pPr>
+              <w:pStyle w:val="18"/>
+              <w:framePr w:hSpace="0" w:wrap="auto" w:vAnchor="margin" w:hAnchor="text" w:xAlign="left" w:yAlign="inline"/>
+              <w:jc w:val="both"/>
+              <w:rPr>
+                <w:lang w:val="ru-RU"/>
+              </w:rPr>
+            </w:pPr>
+          </w:p>
+        </w:tc>
+        <w:tc>
+          <w:tcPr>
+            <w:tcW w:w="4200" w:type="dxa"/>
+            <w:vAlign w:val="center"/>
+          </w:tcPr>
+          <w:p>
+            <w:pPr>
+              <w:pStyle w:val="18"/>
+              <w:framePr w:hSpace="0" w:wrap="auto" w:vAnchor="margin" w:hAnchor="text" w:xAlign="left" w:yAlign="inline"/>
+              <w:jc w:val="both"/>
+            </w:pPr>
+          </w:p>
+        </w:tc>
+      </w:tr>
+    </w:tbl>
+    <w:p>
+      <w:pPr>
+        <w:bidi w:val="0"/>
+        <w:ind w:left="0" w:leftChars="0" w:firstLine="0" w:firstLineChars="0"/>
+      </w:pPr>
+      <w:r>
+        <w:br w:type="page"/>
+      </w:r>
+    </w:p>
+    <w:p>
+      <w:pPr>
+        <w:pStyle w:val="2"/>
+        <w:spacing w:after="360"/>
+        <w:ind w:right="709"/>
+        <w:jc w:val="center"/>
+        <w:rPr>
+          <w:lang w:eastAsia="ru-RU"/>
+        </w:rPr>
+      </w:pPr>
+      <w:bookmarkStart w:id="8" w:name="_Toc229528000"/>
+      <w:r>
+        <w:rPr>
+          <w:lang w:eastAsia="ru-RU"/>
+        </w:rPr>
+        <w:t>Список используемых источников</w:t>
+      </w:r>
+      <w:bookmarkEnd w:id="8"/>
+    </w:p>
+    <w:p>
+      <w:pPr>
+        <w:pStyle w:val="15"/>
+        <w:numPr>
+          <w:ilvl w:val="0"/>
+          <w:numId w:val="5"/>
+        </w:numPr>
+        <w:ind w:left="0" w:firstLine="709"/>
+      </w:pPr>
+      <w:r>
+        <w:t>Web-приложение [Электронный ресурс]. – Режим доступа: https://developer.mozilla.org/ru/docs/Glossary/Progressive_web_apps – Дата доступа: 2</w:t>
+      </w:r>
+      <w:r>
+        <w:rPr>
+          <w:rFonts w:hint="default"/>
+          <w:lang w:val="ru-RU"/>
+        </w:rPr>
+        <w:t>5</w:t>
+      </w:r>
+      <w:r>
+        <w:t>.0</w:t>
+      </w:r>
+      <w:r>
+        <w:rPr>
+          <w:rFonts w:hint="default"/>
+          <w:lang w:val="ru-RU"/>
+        </w:rPr>
+        <w:t>2</w:t>
+      </w:r>
+      <w:r>
+        <w:t>.2026.</w:t>
+      </w:r>
+    </w:p>
+    <w:p>
+      <w:pPr>
+        <w:pStyle w:val="15"/>
+        <w:numPr>
+          <w:ilvl w:val="0"/>
+          <w:numId w:val="5"/>
+        </w:numPr>
+        <w:ind w:left="0" w:firstLine="709"/>
+      </w:pPr>
+      <w:r>
+        <w:rPr>
+          <w:rFonts w:hint="default"/>
+          <w:lang w:val="en-US"/>
+        </w:rPr>
+        <w:t xml:space="preserve">Huntflow </w:t>
+      </w:r>
+      <w:r>
+        <w:t xml:space="preserve">[Электронный ресурс]. – Режим доступа: </w:t>
+      </w:r>
+      <w:r>
+        <w:rPr>
+          <w:color w:val="auto"/>
+          <w:u w:val="none"/>
+        </w:rPr>
+        <w:t>https://</w:t>
+      </w:r>
+      <w:r>
+        <w:rPr>
+          <w:rFonts w:hint="default"/>
+          <w:color w:val="auto"/>
+          <w:u w:val="none"/>
+          <w:lang w:val="en-US"/>
+        </w:rPr>
+        <w:t>huntflow</w:t>
+      </w:r>
+      <w:r>
+        <w:rPr>
+          <w:color w:val="auto"/>
+          <w:u w:val="none"/>
+        </w:rPr>
+        <w:t>.</w:t>
+      </w:r>
+      <w:r>
+        <w:rPr>
+          <w:rFonts w:hint="default"/>
+          <w:color w:val="auto"/>
+          <w:u w:val="none"/>
+          <w:lang w:val="en-US"/>
+        </w:rPr>
+        <w:t>ru</w:t>
+      </w:r>
+      <w:r>
+        <w:rPr>
+          <w:rFonts w:hint="default"/>
+          <w:lang w:val="ru-RU"/>
+        </w:rPr>
+        <w:t xml:space="preserve"> </w:t>
+      </w:r>
+      <w:r>
+        <w:t>– Дата доступа: 2</w:t>
+      </w:r>
+      <w:r>
+        <w:rPr>
+          <w:rFonts w:hint="default"/>
+          <w:lang w:val="en-US"/>
+        </w:rPr>
+        <w:t>5</w:t>
+      </w:r>
+      <w:r>
+        <w:t>.02.2026.</w:t>
+      </w:r>
+    </w:p>
+    <w:p>
+      <w:pPr>
+        <w:pStyle w:val="15"/>
+        <w:numPr>
+          <w:ilvl w:val="0"/>
+          <w:numId w:val="5"/>
+        </w:numPr>
+        <w:ind w:left="0" w:firstLine="709"/>
+      </w:pPr>
+      <w:r>
+        <w:t xml:space="preserve">«TalentTech </w:t>
+      </w:r>
+      <w:r>
+        <w:rPr>
+          <w:rFonts w:hint="default"/>
+          <w:lang w:val="ru-RU"/>
+        </w:rPr>
+        <w:t>Консалтинг</w:t>
+      </w:r>
+      <w:r>
+        <w:t>»</w:t>
+      </w:r>
+      <w:r>
+        <w:rPr>
+          <w:rFonts w:hint="default"/>
+          <w:lang w:val="en-US"/>
+        </w:rPr>
+        <w:t xml:space="preserve"> </w:t>
+      </w:r>
+      <w:r>
+        <w:t xml:space="preserve">[Электронный ресурс]. – Режим доступа: </w:t>
+      </w:r>
+      <w:r>
+        <w:rPr>
+          <w:rFonts w:hint="default"/>
+          <w:lang w:val="en-US"/>
+        </w:rPr>
+        <w:t>https://consulting.talenttech.ru</w:t>
+      </w:r>
+      <w:r>
+        <w:t xml:space="preserve"> – Дата доступа: 2</w:t>
+      </w:r>
+      <w:r>
+        <w:rPr>
+          <w:rFonts w:hint="default"/>
+          <w:lang w:val="en-US"/>
+        </w:rPr>
+        <w:t>5</w:t>
+      </w:r>
+      <w:r>
+        <w:t>.02.2026.</w:t>
+      </w:r>
+    </w:p>
+    <w:p>
+      <w:pPr>
+        <w:pStyle w:val="15"/>
+        <w:numPr>
+          <w:ilvl w:val="0"/>
+          <w:numId w:val="5"/>
+        </w:numPr>
+        <w:ind w:left="0" w:firstLine="709"/>
+      </w:pPr>
+      <w:r>
+        <w:rPr>
+          <w:rFonts w:hint="default"/>
+          <w:lang w:val="en-US"/>
+        </w:rPr>
+        <w:t>Saas [</w:t>
+      </w:r>
+      <w:r>
+        <w:rPr>
+          <w:rFonts w:hint="default"/>
+          <w:lang w:val="ru-RU"/>
+        </w:rPr>
+        <w:t>Электронный ресурс</w:t>
+      </w:r>
+      <w:r>
+        <w:rPr>
+          <w:rFonts w:hint="default"/>
+          <w:lang w:val="en-US"/>
+        </w:rPr>
+        <w:t>]</w:t>
+      </w:r>
+      <w:r>
+        <w:rPr>
+          <w:rFonts w:hint="default"/>
+          <w:lang w:val="ru-RU"/>
+        </w:rPr>
+        <w:t xml:space="preserve">. </w:t>
+      </w:r>
+      <w:r>
+        <w:t xml:space="preserve">Режим доступа: </w:t>
+      </w:r>
+      <w:r>
+        <w:rPr>
+          <w:rFonts w:hint="default"/>
+        </w:rPr>
+        <w:t>https://aws.amazon.com/ru/what-is/saas/</w:t>
+      </w:r>
+      <w:r>
+        <w:t xml:space="preserve"> – Дата доступа: 2</w:t>
+      </w:r>
+      <w:r>
+        <w:rPr>
+          <w:rFonts w:hint="default"/>
+          <w:lang w:val="ru-RU"/>
+        </w:rPr>
+        <w:t>5</w:t>
+      </w:r>
+      <w:r>
+        <w:t>.0</w:t>
+      </w:r>
+      <w:r>
+        <w:rPr>
+          <w:rFonts w:hint="default"/>
+          <w:lang w:val="ru-RU"/>
+        </w:rPr>
+        <w:t>2</w:t>
+      </w:r>
+      <w:r>
+        <w:t>.2026.</w:t>
+      </w:r>
+    </w:p>
+    <w:p>
+      <w:pPr>
+        <w:pStyle w:val="15"/>
+        <w:numPr>
+          <w:ilvl w:val="0"/>
+          <w:numId w:val="5"/>
+        </w:numPr>
+        <w:ind w:left="0" w:firstLine="709"/>
+      </w:pPr>
+      <w:r>
+        <w:rPr>
+          <w:rFonts w:hint="default"/>
+          <w:lang w:val="en-US"/>
+        </w:rPr>
+        <w:t xml:space="preserve">Rabota.by </w:t>
+      </w:r>
+      <w:r>
+        <w:t xml:space="preserve">[Электронный ресурс]. – Режим доступа: </w:t>
+      </w:r>
+      <w:r>
+        <w:rPr>
+          <w:rFonts w:hint="default"/>
+          <w:color w:val="auto"/>
+          <w:u w:val="none"/>
+        </w:rPr>
+        <w:t>https://rabota.by</w:t>
+      </w:r>
+      <w:r>
+        <w:rPr>
+          <w:rFonts w:hint="default"/>
+          <w:lang w:val="en-US"/>
+        </w:rPr>
+        <w:t xml:space="preserve"> </w:t>
+      </w:r>
+      <w:r>
+        <w:t>– Дата доступа: 2</w:t>
+      </w:r>
+      <w:r>
+        <w:rPr>
+          <w:rFonts w:hint="default"/>
+          <w:lang w:val="en-US"/>
+        </w:rPr>
+        <w:t>5</w:t>
+      </w:r>
+      <w:r>
+        <w:t>.02.2026.</w:t>
+      </w:r>
+    </w:p>
+    <w:p>
+      <w:pPr>
+        <w:pStyle w:val="15"/>
+        <w:numPr>
+          <w:ilvl w:val="0"/>
+          <w:numId w:val="5"/>
+        </w:numPr>
+        <w:ind w:left="0" w:firstLine="709"/>
+      </w:pPr>
+      <w:r>
+        <w:rPr>
+          <w:rFonts w:hint="default"/>
+          <w:lang w:val="en-US"/>
+        </w:rPr>
+        <w:t>On-Premises [</w:t>
+      </w:r>
+      <w:r>
+        <w:rPr>
+          <w:rFonts w:hint="default"/>
+          <w:lang w:val="ru-RU"/>
+        </w:rPr>
+        <w:t>Электронный ресурс</w:t>
+      </w:r>
+      <w:r>
+        <w:rPr>
+          <w:rFonts w:hint="default"/>
+          <w:lang w:val="en-US"/>
+        </w:rPr>
+        <w:t>]</w:t>
+      </w:r>
+      <w:r>
+        <w:rPr>
+          <w:rFonts w:hint="default"/>
+          <w:lang w:val="ru-RU"/>
+        </w:rPr>
+        <w:t xml:space="preserve">. </w:t>
+      </w:r>
+      <w:r>
+        <w:t xml:space="preserve">Режим доступа: </w:t>
+      </w:r>
+      <w:r>
+        <w:rPr>
+          <w:rFonts w:hint="default"/>
+        </w:rPr>
+        <w:t>https://www.bitrix24.ru/journal/on-premise/</w:t>
+      </w:r>
+      <w:r>
+        <w:t xml:space="preserve"> – Дата доступа: 2</w:t>
+      </w:r>
+      <w:r>
+        <w:rPr>
+          <w:rFonts w:hint="default"/>
+          <w:lang w:val="ru-RU"/>
+        </w:rPr>
+        <w:t>5</w:t>
+      </w:r>
+      <w:r>
+        <w:t>.0</w:t>
+      </w:r>
+      <w:r>
+        <w:rPr>
+          <w:rFonts w:hint="default"/>
+          <w:lang w:val="ru-RU"/>
+        </w:rPr>
+        <w:t>2</w:t>
+      </w:r>
+      <w:r>
+        <w:t>.2026.</w:t>
+      </w:r>
+    </w:p>
+    <w:p>
+      <w:pPr>
+        <w:pStyle w:val="15"/>
+        <w:numPr>
+          <w:ilvl w:val="0"/>
+          <w:numId w:val="5"/>
+        </w:numPr>
+        <w:ind w:left="0" w:firstLine="709"/>
       </w:pPr>
     </w:p>
     <w:p>
@@ -1699,7 +5245,7 @@
                     </pic:cNvPicPr>
                   </pic:nvPicPr>
                   <pic:blipFill>
-                    <a:blip r:embed="rId6"/>
+                    <a:blip r:embed="rId9"/>
                     <a:stretch>
                       <a:fillRect/>
                     </a:stretch>
@@ -1748,7 +5294,7 @@
                     </pic:cNvPicPr>
                   </pic:nvPicPr>
                   <pic:blipFill>
-                    <a:blip r:embed="rId7"/>
+                    <a:blip r:embed="rId10"/>
                     <a:stretch>
                       <a:fillRect/>
                     </a:stretch>
@@ -1793,7 +5339,7 @@
                     </pic:cNvPicPr>
                   </pic:nvPicPr>
                   <pic:blipFill>
-                    <a:blip r:embed="rId8"/>
+                    <a:blip r:embed="rId11"/>
                     <a:stretch>
                       <a:fillRect/>
                     </a:stretch>
@@ -1993,8 +5539,470 @@
       </w:rPr>
     </w:lvl>
   </w:abstractNum>
+  <w:abstractNum w:abstractNumId="1">
+    <w:nsid w:val="FB4FA089"/>
+    <w:multiLevelType w:val="multilevel"/>
+    <w:tmpl w:val="FB4FA089"/>
+    <w:lvl w:ilvl="0" w:tentative="0">
+      <w:start w:val="1"/>
+      <w:numFmt w:val="bullet"/>
+      <w:suff w:val="space"/>
+      <w:lvlText w:val=""/>
+      <w:lvlJc w:val="left"/>
+      <w:pPr>
+        <w:tabs>
+          <w:tab w:val="left" w:pos="418"/>
+        </w:tabs>
+        <w:ind w:left="0" w:leftChars="0" w:firstLine="709" w:firstLineChars="0"/>
+      </w:pPr>
+      <w:rPr>
+        <w:rFonts w:hint="default" w:ascii="Symbol" w:hAnsi="Symbol" w:cs="Symbol"/>
+      </w:rPr>
+    </w:lvl>
+    <w:lvl w:ilvl="1" w:tentative="0">
+      <w:start w:val="1"/>
+      <w:numFmt w:val="bullet"/>
+      <w:lvlText w:val="o"/>
+      <w:lvlJc w:val="left"/>
+      <w:pPr>
+        <w:tabs>
+          <w:tab w:val="left" w:pos="418"/>
+        </w:tabs>
+        <w:ind w:left="2149" w:hanging="360"/>
+      </w:pPr>
+      <w:rPr>
+        <w:rFonts w:hint="default" w:ascii="Courier New" w:hAnsi="Courier New" w:cs="Courier New"/>
+      </w:rPr>
+    </w:lvl>
+    <w:lvl w:ilvl="2" w:tentative="0">
+      <w:start w:val="1"/>
+      <w:numFmt w:val="bullet"/>
+      <w:lvlText w:val=""/>
+      <w:lvlJc w:val="left"/>
+      <w:pPr>
+        <w:ind w:left="2869" w:hanging="360"/>
+      </w:pPr>
+      <w:rPr>
+        <w:rFonts w:hint="default" w:ascii="Wingdings" w:hAnsi="Wingdings"/>
+      </w:rPr>
+    </w:lvl>
+    <w:lvl w:ilvl="3" w:tentative="0">
+      <w:start w:val="1"/>
+      <w:numFmt w:val="bullet"/>
+      <w:lvlText w:val=""/>
+      <w:lvlJc w:val="left"/>
+      <w:pPr>
+        <w:ind w:left="3589" w:hanging="360"/>
+      </w:pPr>
+      <w:rPr>
+        <w:rFonts w:hint="default" w:ascii="Symbol" w:hAnsi="Symbol"/>
+      </w:rPr>
+    </w:lvl>
+    <w:lvl w:ilvl="4" w:tentative="0">
+      <w:start w:val="1"/>
+      <w:numFmt w:val="bullet"/>
+      <w:lvlText w:val="o"/>
+      <w:lvlJc w:val="left"/>
+      <w:pPr>
+        <w:ind w:left="4309" w:hanging="360"/>
+      </w:pPr>
+      <w:rPr>
+        <w:rFonts w:hint="default" w:ascii="Courier New" w:hAnsi="Courier New" w:cs="Wingdings"/>
+      </w:rPr>
+    </w:lvl>
+    <w:lvl w:ilvl="5" w:tentative="0">
+      <w:start w:val="1"/>
+      <w:numFmt w:val="bullet"/>
+      <w:lvlText w:val=""/>
+      <w:lvlJc w:val="left"/>
+      <w:pPr>
+        <w:ind w:left="5029" w:hanging="360"/>
+      </w:pPr>
+      <w:rPr>
+        <w:rFonts w:hint="default" w:ascii="Wingdings" w:hAnsi="Wingdings"/>
+      </w:rPr>
+    </w:lvl>
+    <w:lvl w:ilvl="6" w:tentative="0">
+      <w:start w:val="1"/>
+      <w:numFmt w:val="bullet"/>
+      <w:lvlText w:val=""/>
+      <w:lvlJc w:val="left"/>
+      <w:pPr>
+        <w:ind w:left="5749" w:hanging="360"/>
+      </w:pPr>
+      <w:rPr>
+        <w:rFonts w:hint="default" w:ascii="Symbol" w:hAnsi="Symbol"/>
+      </w:rPr>
+    </w:lvl>
+    <w:lvl w:ilvl="7" w:tentative="0">
+      <w:start w:val="1"/>
+      <w:numFmt w:val="bullet"/>
+      <w:lvlText w:val="o"/>
+      <w:lvlJc w:val="left"/>
+      <w:pPr>
+        <w:ind w:left="6469" w:hanging="360"/>
+      </w:pPr>
+      <w:rPr>
+        <w:rFonts w:hint="default" w:ascii="Courier New" w:hAnsi="Courier New" w:cs="Wingdings"/>
+      </w:rPr>
+    </w:lvl>
+    <w:lvl w:ilvl="8" w:tentative="0">
+      <w:start w:val="1"/>
+      <w:numFmt w:val="bullet"/>
+      <w:lvlText w:val=""/>
+      <w:lvlJc w:val="left"/>
+      <w:pPr>
+        <w:ind w:left="7189" w:hanging="360"/>
+      </w:pPr>
+      <w:rPr>
+        <w:rFonts w:hint="default" w:ascii="Wingdings" w:hAnsi="Wingdings"/>
+      </w:rPr>
+    </w:lvl>
+  </w:abstractNum>
+  <w:abstractNum w:abstractNumId="2">
+    <w:nsid w:val="650F3C0F"/>
+    <w:multiLevelType w:val="multilevel"/>
+    <w:tmpl w:val="650F3C0F"/>
+    <w:lvl w:ilvl="0" w:tentative="0">
+      <w:start w:val="1"/>
+      <w:numFmt w:val="decimal"/>
+      <w:suff w:val="space"/>
+      <w:lvlText w:val="%1"/>
+      <w:lvlJc w:val="left"/>
+      <w:pPr>
+        <w:ind w:left="2138" w:hanging="360"/>
+      </w:pPr>
+      <w:rPr>
+        <w:rFonts w:hint="default"/>
+      </w:rPr>
+    </w:lvl>
+    <w:lvl w:ilvl="1" w:tentative="0">
+      <w:start w:val="1"/>
+      <w:numFmt w:val="lowerLetter"/>
+      <w:lvlText w:val="%2."/>
+      <w:lvlJc w:val="left"/>
+      <w:pPr>
+        <w:ind w:left="2149" w:hanging="360"/>
+      </w:pPr>
+    </w:lvl>
+    <w:lvl w:ilvl="2" w:tentative="0">
+      <w:start w:val="1"/>
+      <w:numFmt w:val="lowerRoman"/>
+      <w:lvlText w:val="%3."/>
+      <w:lvlJc w:val="right"/>
+      <w:pPr>
+        <w:ind w:left="2869" w:hanging="180"/>
+      </w:pPr>
+    </w:lvl>
+    <w:lvl w:ilvl="3" w:tentative="0">
+      <w:start w:val="1"/>
+      <w:numFmt w:val="decimal"/>
+      <w:lvlText w:val="%4."/>
+      <w:lvlJc w:val="left"/>
+      <w:pPr>
+        <w:ind w:left="3589" w:hanging="360"/>
+      </w:pPr>
+    </w:lvl>
+    <w:lvl w:ilvl="4" w:tentative="0">
+      <w:start w:val="1"/>
+      <w:numFmt w:val="lowerLetter"/>
+      <w:lvlText w:val="%5."/>
+      <w:lvlJc w:val="left"/>
+      <w:pPr>
+        <w:ind w:left="4309" w:hanging="360"/>
+      </w:pPr>
+    </w:lvl>
+    <w:lvl w:ilvl="5" w:tentative="0">
+      <w:start w:val="1"/>
+      <w:numFmt w:val="lowerRoman"/>
+      <w:lvlText w:val="%6."/>
+      <w:lvlJc w:val="right"/>
+      <w:pPr>
+        <w:ind w:left="5029" w:hanging="180"/>
+      </w:pPr>
+    </w:lvl>
+    <w:lvl w:ilvl="6" w:tentative="0">
+      <w:start w:val="1"/>
+      <w:numFmt w:val="decimal"/>
+      <w:lvlText w:val="%7."/>
+      <w:lvlJc w:val="left"/>
+      <w:pPr>
+        <w:ind w:left="5749" w:hanging="360"/>
+      </w:pPr>
+    </w:lvl>
+    <w:lvl w:ilvl="7" w:tentative="0">
+      <w:start w:val="1"/>
+      <w:numFmt w:val="lowerLetter"/>
+      <w:lvlText w:val="%8."/>
+      <w:lvlJc w:val="left"/>
+      <w:pPr>
+        <w:ind w:left="6469" w:hanging="360"/>
+      </w:pPr>
+    </w:lvl>
+    <w:lvl w:ilvl="8" w:tentative="0">
+      <w:start w:val="1"/>
+      <w:numFmt w:val="lowerRoman"/>
+      <w:lvlText w:val="%9."/>
+      <w:lvlJc w:val="right"/>
+      <w:pPr>
+        <w:ind w:left="7189" w:hanging="180"/>
+      </w:pPr>
+    </w:lvl>
+  </w:abstractNum>
+  <w:abstractNum w:abstractNumId="3">
+    <w:nsid w:val="6C5E7F54"/>
+    <w:multiLevelType w:val="multilevel"/>
+    <w:tmpl w:val="6C5E7F54"/>
+    <w:lvl w:ilvl="0" w:tentative="0">
+      <w:start w:val="1"/>
+      <w:numFmt w:val="bullet"/>
+      <w:suff w:val="space"/>
+      <w:lvlText w:val=""/>
+      <w:lvlJc w:val="left"/>
+      <w:pPr>
+        <w:tabs>
+          <w:tab w:val="left" w:pos="418"/>
+        </w:tabs>
+        <w:ind w:left="0" w:leftChars="0" w:firstLine="709" w:firstLineChars="0"/>
+      </w:pPr>
+      <w:rPr>
+        <w:rFonts w:hint="default" w:ascii="Symbol" w:hAnsi="Symbol" w:cs="Symbol"/>
+      </w:rPr>
+    </w:lvl>
+    <w:lvl w:ilvl="1" w:tentative="0">
+      <w:start w:val="1"/>
+      <w:numFmt w:val="bullet"/>
+      <w:lvlText w:val="o"/>
+      <w:lvlJc w:val="left"/>
+      <w:pPr>
+        <w:tabs>
+          <w:tab w:val="left" w:pos="418"/>
+        </w:tabs>
+        <w:ind w:left="2149" w:hanging="360"/>
+      </w:pPr>
+      <w:rPr>
+        <w:rFonts w:hint="default" w:ascii="Courier New" w:hAnsi="Courier New" w:cs="Courier New"/>
+      </w:rPr>
+    </w:lvl>
+    <w:lvl w:ilvl="2" w:tentative="0">
+      <w:start w:val="1"/>
+      <w:numFmt w:val="bullet"/>
+      <w:lvlText w:val=""/>
+      <w:lvlJc w:val="left"/>
+      <w:pPr>
+        <w:ind w:left="2869" w:hanging="360"/>
+      </w:pPr>
+      <w:rPr>
+        <w:rFonts w:hint="default" w:ascii="Wingdings" w:hAnsi="Wingdings"/>
+      </w:rPr>
+    </w:lvl>
+    <w:lvl w:ilvl="3" w:tentative="0">
+      <w:start w:val="1"/>
+      <w:numFmt w:val="bullet"/>
+      <w:lvlText w:val=""/>
+      <w:lvlJc w:val="left"/>
+      <w:pPr>
+        <w:ind w:left="3589" w:hanging="360"/>
+      </w:pPr>
+      <w:rPr>
+        <w:rFonts w:hint="default" w:ascii="Symbol" w:hAnsi="Symbol"/>
+      </w:rPr>
+    </w:lvl>
+    <w:lvl w:ilvl="4" w:tentative="0">
+      <w:start w:val="1"/>
+      <w:numFmt w:val="bullet"/>
+      <w:lvlText w:val="o"/>
+      <w:lvlJc w:val="left"/>
+      <w:pPr>
+        <w:ind w:left="4309" w:hanging="360"/>
+      </w:pPr>
+      <w:rPr>
+        <w:rFonts w:hint="default" w:ascii="Courier New" w:hAnsi="Courier New" w:cs="Wingdings"/>
+      </w:rPr>
+    </w:lvl>
+    <w:lvl w:ilvl="5" w:tentative="0">
+      <w:start w:val="1"/>
+      <w:numFmt w:val="bullet"/>
+      <w:lvlText w:val=""/>
+      <w:lvlJc w:val="left"/>
+      <w:pPr>
+        <w:ind w:left="5029" w:hanging="360"/>
+      </w:pPr>
+      <w:rPr>
+        <w:rFonts w:hint="default" w:ascii="Wingdings" w:hAnsi="Wingdings"/>
+      </w:rPr>
+    </w:lvl>
+    <w:lvl w:ilvl="6" w:tentative="0">
+      <w:start w:val="1"/>
+      <w:numFmt w:val="bullet"/>
+      <w:lvlText w:val=""/>
+      <w:lvlJc w:val="left"/>
+      <w:pPr>
+        <w:ind w:left="5749" w:hanging="360"/>
+      </w:pPr>
+      <w:rPr>
+        <w:rFonts w:hint="default" w:ascii="Symbol" w:hAnsi="Symbol"/>
+      </w:rPr>
+    </w:lvl>
+    <w:lvl w:ilvl="7" w:tentative="0">
+      <w:start w:val="1"/>
+      <w:numFmt w:val="bullet"/>
+      <w:lvlText w:val="o"/>
+      <w:lvlJc w:val="left"/>
+      <w:pPr>
+        <w:ind w:left="6469" w:hanging="360"/>
+      </w:pPr>
+      <w:rPr>
+        <w:rFonts w:hint="default" w:ascii="Courier New" w:hAnsi="Courier New" w:cs="Wingdings"/>
+      </w:rPr>
+    </w:lvl>
+    <w:lvl w:ilvl="8" w:tentative="0">
+      <w:start w:val="1"/>
+      <w:numFmt w:val="bullet"/>
+      <w:lvlText w:val=""/>
+      <w:lvlJc w:val="left"/>
+      <w:pPr>
+        <w:ind w:left="7189" w:hanging="360"/>
+      </w:pPr>
+      <w:rPr>
+        <w:rFonts w:hint="default" w:ascii="Wingdings" w:hAnsi="Wingdings"/>
+      </w:rPr>
+    </w:lvl>
+  </w:abstractNum>
+  <w:abstractNum w:abstractNumId="4">
+    <w:nsid w:val="7518D49A"/>
+    <w:multiLevelType w:val="multilevel"/>
+    <w:tmpl w:val="7518D49A"/>
+    <w:lvl w:ilvl="0" w:tentative="0">
+      <w:start w:val="1"/>
+      <w:numFmt w:val="bullet"/>
+      <w:suff w:val="space"/>
+      <w:lvlText w:val=""/>
+      <w:lvlJc w:val="left"/>
+      <w:pPr>
+        <w:tabs>
+          <w:tab w:val="left" w:pos="418"/>
+        </w:tabs>
+        <w:ind w:left="0" w:leftChars="0" w:firstLine="709" w:firstLineChars="0"/>
+      </w:pPr>
+      <w:rPr>
+        <w:rFonts w:hint="default" w:ascii="Symbol" w:hAnsi="Symbol" w:cs="Symbol"/>
+      </w:rPr>
+    </w:lvl>
+    <w:lvl w:ilvl="1" w:tentative="0">
+      <w:start w:val="1"/>
+      <w:numFmt w:val="bullet"/>
+      <w:lvlText w:val="o"/>
+      <w:lvlJc w:val="left"/>
+      <w:pPr>
+        <w:tabs>
+          <w:tab w:val="left" w:pos="418"/>
+        </w:tabs>
+        <w:ind w:left="2149" w:hanging="360"/>
+      </w:pPr>
+      <w:rPr>
+        <w:rFonts w:hint="default" w:ascii="Courier New" w:hAnsi="Courier New" w:cs="Courier New"/>
+      </w:rPr>
+    </w:lvl>
+    <w:lvl w:ilvl="2" w:tentative="0">
+      <w:start w:val="1"/>
+      <w:numFmt w:val="bullet"/>
+      <w:lvlText w:val=""/>
+      <w:lvlJc w:val="left"/>
+      <w:pPr>
+        <w:ind w:left="2869" w:hanging="360"/>
+      </w:pPr>
+      <w:rPr>
+        <w:rFonts w:hint="default" w:ascii="Wingdings" w:hAnsi="Wingdings"/>
+      </w:rPr>
+    </w:lvl>
+    <w:lvl w:ilvl="3" w:tentative="0">
+      <w:start w:val="1"/>
+      <w:numFmt w:val="bullet"/>
+      <w:lvlText w:val=""/>
+      <w:lvlJc w:val="left"/>
+      <w:pPr>
+        <w:ind w:left="3589" w:hanging="360"/>
+      </w:pPr>
+      <w:rPr>
+        <w:rFonts w:hint="default" w:ascii="Symbol" w:hAnsi="Symbol"/>
+      </w:rPr>
+    </w:lvl>
+    <w:lvl w:ilvl="4" w:tentative="0">
+      <w:start w:val="1"/>
+      <w:numFmt w:val="bullet"/>
+      <w:lvlText w:val="o"/>
+      <w:lvlJc w:val="left"/>
+      <w:pPr>
+        <w:ind w:left="4309" w:hanging="360"/>
+      </w:pPr>
+      <w:rPr>
+        <w:rFonts w:hint="default" w:ascii="Courier New" w:hAnsi="Courier New" w:cs="Wingdings"/>
+      </w:rPr>
+    </w:lvl>
+    <w:lvl w:ilvl="5" w:tentative="0">
+      <w:start w:val="1"/>
+      <w:numFmt w:val="bullet"/>
+      <w:lvlText w:val=""/>
+      <w:lvlJc w:val="left"/>
+      <w:pPr>
+        <w:ind w:left="5029" w:hanging="360"/>
+      </w:pPr>
+      <w:rPr>
+        <w:rFonts w:hint="default" w:ascii="Wingdings" w:hAnsi="Wingdings"/>
+      </w:rPr>
+    </w:lvl>
+    <w:lvl w:ilvl="6" w:tentative="0">
+      <w:start w:val="1"/>
+      <w:numFmt w:val="bullet"/>
+      <w:lvlText w:val=""/>
+      <w:lvlJc w:val="left"/>
+      <w:pPr>
+        <w:ind w:left="5749" w:hanging="360"/>
+      </w:pPr>
+      <w:rPr>
+        <w:rFonts w:hint="default" w:ascii="Symbol" w:hAnsi="Symbol"/>
+      </w:rPr>
+    </w:lvl>
+    <w:lvl w:ilvl="7" w:tentative="0">
+      <w:start w:val="1"/>
+      <w:numFmt w:val="bullet"/>
+      <w:lvlText w:val="o"/>
+      <w:lvlJc w:val="left"/>
+      <w:pPr>
+        <w:ind w:left="6469" w:hanging="360"/>
+      </w:pPr>
+      <w:rPr>
+        <w:rFonts w:hint="default" w:ascii="Courier New" w:hAnsi="Courier New" w:cs="Wingdings"/>
+      </w:rPr>
+    </w:lvl>
+    <w:lvl w:ilvl="8" w:tentative="0">
+      <w:start w:val="1"/>
+      <w:numFmt w:val="bullet"/>
+      <w:lvlText w:val=""/>
+      <w:lvlJc w:val="left"/>
+      <w:pPr>
+        <w:ind w:left="7189" w:hanging="360"/>
+      </w:pPr>
+      <w:rPr>
+        <w:rFonts w:hint="default" w:ascii="Wingdings" w:hAnsi="Wingdings"/>
+      </w:rPr>
+    </w:lvl>
+  </w:abstractNum>
   <w:num w:numId="1">
     <w:abstractNumId w:val="0"/>
+  </w:num>
+  <w:num w:numId="2">
+    <w:abstractNumId w:val="4"/>
+  </w:num>
+  <w:num w:numId="3">
+    <w:abstractNumId w:val="3"/>
+  </w:num>
+  <w:num w:numId="4">
+    <w:abstractNumId w:val="1"/>
+  </w:num>
+  <w:num w:numId="5">
+    <w:abstractNumId w:val="2"/>
   </w:num>
 </w:numbering>
 </file>
@@ -2012,8 +6020,8 @@
   <w:latentStyles w:count="260" w:defQFormat="0" w:defUnhideWhenUsed="1" w:defSemiHidden="1" w:defUIPriority="99" w:defLockedState="0">
     <w:lsdException w:qFormat="1" w:unhideWhenUsed="0" w:uiPriority="0" w:semiHidden="0" w:name="Normal"/>
     <w:lsdException w:qFormat="1" w:unhideWhenUsed="0" w:uiPriority="0" w:semiHidden="0" w:name="heading 1"/>
-    <w:lsdException w:qFormat="1" w:uiPriority="0" w:name="heading 2"/>
-    <w:lsdException w:qFormat="1" w:uiPriority="0" w:name="heading 3"/>
+    <w:lsdException w:qFormat="1" w:uiPriority="0" w:semiHidden="0" w:name="heading 2"/>
+    <w:lsdException w:qFormat="1" w:uiPriority="0" w:semiHidden="0" w:name="heading 3"/>
     <w:lsdException w:qFormat="1" w:uiPriority="0" w:name="heading 4"/>
     <w:lsdException w:qFormat="1" w:uiPriority="0" w:name="heading 5"/>
     <w:lsdException w:qFormat="1" w:uiPriority="0" w:name="heading 6"/>
@@ -2029,7 +6037,7 @@
     <w:lsdException w:unhideWhenUsed="0" w:uiPriority="0" w:semiHidden="0" w:name="index 7"/>
     <w:lsdException w:unhideWhenUsed="0" w:uiPriority="0" w:semiHidden="0" w:name="index 8"/>
     <w:lsdException w:unhideWhenUsed="0" w:uiPriority="0" w:semiHidden="0" w:name="index 9"/>
-    <w:lsdException w:uiPriority="39" w:semiHidden="0" w:name="toc 1"/>
+    <w:lsdException w:qFormat="1" w:uiPriority="39" w:semiHidden="0" w:name="toc 1"/>
     <w:lsdException w:qFormat="1" w:uiPriority="39" w:semiHidden="0" w:name="toc 2"/>
     <w:lsdException w:qFormat="1" w:uiPriority="39" w:semiHidden="0" w:name="toc 3"/>
     <w:lsdException w:unhideWhenUsed="0" w:uiPriority="0" w:semiHidden="0" w:name="toc 4"/>
@@ -2102,7 +6110,7 @@
     <w:lsdException w:unhideWhenUsed="0" w:uiPriority="0" w:semiHidden="0" w:name="Document Map"/>
     <w:lsdException w:unhideWhenUsed="0" w:uiPriority="0" w:semiHidden="0" w:name="Plain Text"/>
     <w:lsdException w:unhideWhenUsed="0" w:uiPriority="0" w:semiHidden="0" w:name="E-mail Signature"/>
-    <w:lsdException w:unhideWhenUsed="0" w:uiPriority="0" w:semiHidden="0" w:name="Normal (Web)"/>
+    <w:lsdException w:qFormat="1" w:unhideWhenUsed="0" w:uiPriority="0" w:semiHidden="0" w:name="Normal (Web)"/>
     <w:lsdException w:unhideWhenUsed="0" w:uiPriority="0" w:semiHidden="0" w:name="HTML Acronym"/>
     <w:lsdException w:unhideWhenUsed="0" w:uiPriority="0" w:semiHidden="0" w:name="HTML Address"/>
     <w:lsdException w:unhideWhenUsed="0" w:uiPriority="0" w:semiHidden="0" w:name="HTML Cite"/>
@@ -2158,8 +6166,9 @@
     <w:lsdException w:unhideWhenUsed="0" w:uiPriority="0" w:semiHidden="0" w:name="Table Web 2"/>
     <w:lsdException w:unhideWhenUsed="0" w:uiPriority="0" w:semiHidden="0" w:name="Table Web 3"/>
     <w:lsdException w:unhideWhenUsed="0" w:uiPriority="0" w:semiHidden="0" w:name="Balloon Text"/>
-    <w:lsdException w:unhideWhenUsed="0" w:uiPriority="0" w:semiHidden="0" w:name="Table Grid"/>
+    <w:lsdException w:qFormat="1" w:unhideWhenUsed="0" w:uiPriority="39" w:semiHidden="0" w:name="Table Grid"/>
     <w:lsdException w:unhideWhenUsed="0" w:uiPriority="0" w:semiHidden="0" w:name="Table Theme"/>
+    <w:lsdException w:qFormat="1" w:unhideWhenUsed="0" w:uiPriority="34" w:semiHidden="0" w:name="List Paragraph"/>
   </w:latentStyles>
   <w:style w:type="paragraph" w:default="1" w:styleId="1">
     <w:name w:val="Normal"/>
@@ -2195,7 +6204,6 @@
       <w:b/>
       <w:bCs/>
       <w:kern w:val="32"/>
-      <w:sz w:val="28"/>
       <w:szCs w:val="32"/>
     </w:rPr>
   </w:style>
@@ -2203,7 +6211,6 @@
     <w:name w:val="heading 2"/>
     <w:basedOn w:val="2"/>
     <w:next w:val="1"/>
-    <w:semiHidden/>
     <w:unhideWhenUsed/>
     <w:qFormat/>
     <w:uiPriority w:val="0"/>
@@ -2215,14 +6222,34 @@
       <w:outlineLvl w:val="1"/>
     </w:pPr>
     <w:rPr>
-      <w:rFonts w:ascii="Times New Roman" w:hAnsi="Times New Roman" w:cs="Arial"/>
       <w:iCs/>
-      <w:sz w:val="28"/>
       <w:szCs w:val="28"/>
     </w:rPr>
   </w:style>
   <w:style w:type="paragraph" w:styleId="4">
     <w:name w:val="heading 3"/>
+    <w:next w:val="1"/>
+    <w:unhideWhenUsed/>
+    <w:qFormat/>
+    <w:uiPriority w:val="0"/>
+    <w:pPr>
+      <w:spacing w:beforeAutospacing="0" w:after="240" w:afterAutospacing="0"/>
+      <w:ind w:firstLine="706"/>
+      <w:jc w:val="left"/>
+      <w:outlineLvl w:val="2"/>
+    </w:pPr>
+    <w:rPr>
+      <w:rFonts w:hint="default" w:ascii="Times New Roman" w:hAnsi="Times New Roman" w:eastAsia="SimSun" w:cs="SimSun"/>
+      <w:b/>
+      <w:bCs/>
+      <w:kern w:val="0"/>
+      <w:sz w:val="28"/>
+      <w:szCs w:val="26"/>
+      <w:lang w:val="en-US" w:eastAsia="zh-CN" w:bidi="ar"/>
+    </w:rPr>
+  </w:style>
+  <w:style w:type="paragraph" w:styleId="5">
+    <w:name w:val="heading 4"/>
     <w:next w:val="1"/>
     <w:semiHidden/>
     <w:unhideWhenUsed/>
@@ -2237,18 +6264,18 @@
       <w:b/>
       <w:bCs/>
       <w:kern w:val="0"/>
-      <w:sz w:val="26"/>
-      <w:szCs w:val="26"/>
+      <w:sz w:val="24"/>
+      <w:szCs w:val="24"/>
       <w:lang w:val="en-US" w:eastAsia="zh-CN" w:bidi="ar"/>
     </w:rPr>
   </w:style>
-  <w:style w:type="character" w:default="1" w:styleId="5">
+  <w:style w:type="character" w:default="1" w:styleId="6">
     <w:name w:val="Default Paragraph Font"/>
     <w:semiHidden/>
     <w:qFormat/>
     <w:uiPriority w:val="0"/>
   </w:style>
-  <w:style w:type="table" w:default="1" w:styleId="6">
+  <w:style w:type="table" w:default="1" w:styleId="7">
     <w:name w:val="Normal Table"/>
     <w:semiHidden/>
     <w:qFormat/>
@@ -2262,9 +6289,9 @@
       </w:tblCellMar>
     </w:tblPr>
   </w:style>
-  <w:style w:type="character" w:styleId="7">
+  <w:style w:type="character" w:styleId="8">
     <w:name w:val="Hyperlink"/>
-    <w:basedOn w:val="5"/>
+    <w:basedOn w:val="6"/>
     <w:unhideWhenUsed/>
     <w:qFormat/>
     <w:uiPriority w:val="99"/>
@@ -2278,11 +6305,12 @@
       </w14:textFill>
     </w:rPr>
   </w:style>
-  <w:style w:type="paragraph" w:styleId="8">
+  <w:style w:type="paragraph" w:styleId="9">
     <w:name w:val="toc 1"/>
     <w:basedOn w:val="1"/>
     <w:next w:val="1"/>
     <w:unhideWhenUsed/>
+    <w:qFormat/>
     <w:uiPriority w:val="39"/>
     <w:pPr>
       <w:tabs>
@@ -2293,7 +6321,7 @@
       <w:ind w:firstLine="0"/>
     </w:pPr>
   </w:style>
-  <w:style w:type="paragraph" w:styleId="9">
+  <w:style w:type="paragraph" w:styleId="10">
     <w:name w:val="toc 3"/>
     <w:basedOn w:val="1"/>
     <w:next w:val="1"/>
@@ -2304,7 +6332,7 @@
       <w:ind w:firstLine="652"/>
     </w:pPr>
   </w:style>
-  <w:style w:type="paragraph" w:styleId="10">
+  <w:style w:type="paragraph" w:styleId="11">
     <w:name w:val="toc 2"/>
     <w:next w:val="1"/>
     <w:unhideWhenUsed/>
@@ -2332,8 +6360,9 @@
       <w14:ligatures w14:val="standardContextual"/>
     </w:rPr>
   </w:style>
-  <w:style w:type="paragraph" w:styleId="11">
+  <w:style w:type="paragraph" w:styleId="12">
     <w:name w:val="Normal (Web)"/>
+    <w:qFormat/>
     <w:uiPriority w:val="0"/>
     <w:pPr>
       <w:spacing w:before="0" w:beforeAutospacing="1" w:after="0" w:afterAutospacing="1"/>
@@ -2341,13 +6370,33 @@
       <w:jc w:val="left"/>
     </w:pPr>
     <w:rPr>
+      <w:rFonts w:ascii="Times New Roman" w:hAnsi="Times New Roman" w:eastAsia="SimSun" w:cs="Times New Roman"/>
       <w:kern w:val="0"/>
       <w:sz w:val="24"/>
       <w:szCs w:val="24"/>
       <w:lang w:val="en-US" w:eastAsia="zh-CN" w:bidi="ar"/>
     </w:rPr>
   </w:style>
-  <w:style w:type="paragraph" w:customStyle="1" w:styleId="12">
+  <w:style w:type="table" w:styleId="13">
+    <w:name w:val="Table Grid"/>
+    <w:basedOn w:val="7"/>
+    <w:qFormat/>
+    <w:uiPriority w:val="39"/>
+    <w:pPr>
+      <w:spacing w:after="0" w:line="240" w:lineRule="auto"/>
+    </w:pPr>
+    <w:tblPr>
+      <w:tblBorders>
+        <w:top w:val="single" w:color="auto" w:sz="4" w:space="0"/>
+        <w:left w:val="single" w:color="auto" w:sz="4" w:space="0"/>
+        <w:bottom w:val="single" w:color="auto" w:sz="4" w:space="0"/>
+        <w:right w:val="single" w:color="auto" w:sz="4" w:space="0"/>
+        <w:insideH w:val="single" w:color="auto" w:sz="4" w:space="0"/>
+        <w:insideV w:val="single" w:color="auto" w:sz="4" w:space="0"/>
+      </w:tblBorders>
+    </w:tblPr>
+  </w:style>
+  <w:style w:type="paragraph" w:customStyle="1" w:styleId="14">
     <w:name w:val="TOC Heading"/>
     <w:basedOn w:val="2"/>
     <w:next w:val="1"/>
@@ -2365,6 +6414,47 @@
       <w:lang w:eastAsia="ru-RU"/>
       <w14:ligatures w14:val="none"/>
     </w:rPr>
+  </w:style>
+  <w:style w:type="paragraph" w:styleId="15">
+    <w:name w:val="List Paragraph"/>
+    <w:basedOn w:val="1"/>
+    <w:qFormat/>
+    <w:uiPriority w:val="34"/>
+    <w:pPr>
+      <w:ind w:left="0" w:firstLine="706"/>
+      <w:contextualSpacing/>
+    </w:pPr>
+  </w:style>
+  <w:style w:type="paragraph" w:customStyle="1" w:styleId="16">
+    <w:name w:val="назврис"/>
+    <w:basedOn w:val="17"/>
+    <w:qFormat/>
+    <w:uiPriority w:val="0"/>
+    <w:pPr>
+      <w:spacing w:before="120" w:after="280" w:line="259" w:lineRule="auto"/>
+    </w:pPr>
+  </w:style>
+  <w:style w:type="paragraph" w:customStyle="1" w:styleId="17">
+    <w:name w:val="рисунок"/>
+    <w:basedOn w:val="1"/>
+    <w:qFormat/>
+    <w:uiPriority w:val="0"/>
+    <w:pPr>
+      <w:spacing w:before="280" w:after="120"/>
+      <w:ind w:firstLine="0"/>
+      <w:jc w:val="center"/>
+    </w:pPr>
+  </w:style>
+  <w:style w:type="paragraph" w:customStyle="1" w:styleId="18">
+    <w:name w:val="табличный"/>
+    <w:basedOn w:val="15"/>
+    <w:qFormat/>
+    <w:uiPriority w:val="0"/>
+    <w:pPr>
+      <w:framePr w:hSpace="180" w:wrap="around" w:vAnchor="text" w:hAnchor="text" w:xAlign="center" w:y="1"/>
+      <w:suppressOverlap/>
+      <w:ind w:left="0" w:firstLine="0"/>
+    </w:pPr>
   </w:style>
 </w:styles>
 </file>

</xml_diff>